<commit_message>
Sync from private source SHA: a0276079db65ee172146fcb1708c4cbc6a7adf3d
</commit_message>
<xml_diff>
--- a/Docs/04Cor_Reg/多元线性回归案例结果.docx
+++ b/Docs/04Cor_Reg/多元线性回归案例结果.docx
@@ -1,6 +1,6 @@
 
 <file path=word/document.xml><?xml version="1.0" encoding="utf-8"?>
-<w:document xmlns:wpc="http://schemas.microsoft.com/office/word/2010/wordprocessingCanvas" xmlns:mc="http://schemas.openxmlformats.org/markup-compatibility/2006" xmlns:o="urn:schemas-microsoft-com:office:office" xmlns:r="http://schemas.openxmlformats.org/officeDocument/2006/relationships" xmlns:m="http://schemas.openxmlformats.org/officeDocument/2006/math" xmlns:v="urn:schemas-microsoft-com:vml" xmlns:wp14="http://schemas.microsoft.com/office/word/2010/wordprocessingDrawing" xmlns:wp="http://schemas.openxmlformats.org/drawingml/2006/wordprocessingDrawing" xmlns:w="http://schemas.openxmlformats.org/wordprocessingml/2006/main" xmlns:w14="http://schemas.microsoft.com/office/word/2010/wordml" xmlns:w10="urn:schemas-microsoft-com:office:word" xmlns:w15="http://schemas.microsoft.com/office/word/2012/wordml" xmlns:wpg="http://schemas.microsoft.com/office/word/2010/wordprocessingGroup" xmlns:wpi="http://schemas.microsoft.com/office/word/2010/wordprocessingInk" xmlns:wne="http://schemas.microsoft.com/office/word/2006/wordml" xmlns:wps="http://schemas.microsoft.com/office/word/2010/wordprocessingShape" xmlns:wpsCustomData="http://www.wps.cn/officeDocument/2013/wpsCustomData" mc:Ignorable="w14 w15 wp14">
+<w:document xmlns:wpc="http://schemas.microsoft.com/office/word/2010/wordprocessingCanvas" xmlns:cx="http://schemas.microsoft.com/office/drawing/2014/chartex" xmlns:cx1="http://schemas.microsoft.com/office/drawing/2015/9/8/chartex" xmlns:cx2="http://schemas.microsoft.com/office/drawing/2015/10/21/chartex" xmlns:cx3="http://schemas.microsoft.com/office/drawing/2016/5/9/chartex" xmlns:cx4="http://schemas.microsoft.com/office/drawing/2016/5/10/chartex" xmlns:cx5="http://schemas.microsoft.com/office/drawing/2016/5/11/chartex" xmlns:cx6="http://schemas.microsoft.com/office/drawing/2016/5/12/chartex" xmlns:cx7="http://schemas.microsoft.com/office/drawing/2016/5/13/chartex" xmlns:cx8="http://schemas.microsoft.com/office/drawing/2016/5/14/chartex" xmlns:mc="http://schemas.openxmlformats.org/markup-compatibility/2006" xmlns:o="urn:schemas-microsoft-com:office:office" xmlns:r="http://schemas.openxmlformats.org/officeDocument/2006/relationships" xmlns:m="http://schemas.openxmlformats.org/officeDocument/2006/math" xmlns:v="urn:schemas-microsoft-com:vml" xmlns:wp14="http://schemas.microsoft.com/office/word/2010/wordprocessingDrawing" xmlns:wp="http://schemas.openxmlformats.org/drawingml/2006/wordprocessingDrawing" xmlns:w="http://schemas.openxmlformats.org/wordprocessingml/2006/main" xmlns:w14="http://schemas.microsoft.com/office/word/2010/wordml" xmlns:w10="urn:schemas-microsoft-com:office:word" xmlns:w15="http://schemas.microsoft.com/office/word/2012/wordml" xmlns:wpg="http://schemas.microsoft.com/office/word/2010/wordprocessingGroup" xmlns:wpi="http://schemas.microsoft.com/office/word/2010/wordprocessingInk" xmlns:wne="http://schemas.microsoft.com/office/word/2006/wordml" xmlns:wps="http://schemas.microsoft.com/office/word/2010/wordprocessingShape" xmlns:wpsCustomData="http://www.wps.cn/officeDocument/2013/wpsCustomData" mc:Ignorable="w14 w15 wp14">
   <w:body>
     <w:p>
       <w:pPr>
@@ -5650,8 +5650,6 @@
         </w:rPr>
         <w:t xml:space="preserve"> = 0.874, </w:t>
       </w:r>
-      <w:bookmarkStart w:id="0" w:name="_GoBack"/>
-      <w:bookmarkEnd w:id="0"/>
       <w:r>
         <w:rPr>
           <w:rFonts w:hint="default" w:asciiTheme="minorEastAsia" w:hAnsiTheme="minorEastAsia" w:cstheme="minorEastAsia"/>
@@ -9767,21 +9765,21 @@
         </w:tblCellMar>
       </w:tblPr>
       <w:tblGrid>
-        <w:gridCol w:w="1863"/>
+        <w:gridCol w:w="1862"/>
         <w:gridCol w:w="1009"/>
         <w:gridCol w:w="1103"/>
         <w:gridCol w:w="941"/>
         <w:gridCol w:w="870"/>
-        <w:gridCol w:w="267"/>
+        <w:gridCol w:w="266"/>
         <w:gridCol w:w="1009"/>
         <w:gridCol w:w="1103"/>
         <w:gridCol w:w="941"/>
         <w:gridCol w:w="870"/>
-        <w:gridCol w:w="267"/>
+        <w:gridCol w:w="266"/>
         <w:gridCol w:w="1009"/>
-        <w:gridCol w:w="1103"/>
-        <w:gridCol w:w="942"/>
-        <w:gridCol w:w="871"/>
+        <w:gridCol w:w="1104"/>
+        <w:gridCol w:w="943"/>
+        <w:gridCol w:w="872"/>
       </w:tblGrid>
       <w:tr>
         <w:trPr>
@@ -10253,7 +10251,7 @@
             </w:pPr>
             <w:r>
               <w:rPr>
-                <w:rFonts w:hint="eastAsia" w:ascii="宋体" w:hAnsi="宋体" w:eastAsia="宋体" w:cs="宋体"/>
+                <w:rFonts w:hint="default" w:ascii="宋体" w:hAnsi="宋体" w:eastAsia="宋体" w:cs="宋体"/>
                 <w:b w:val="0"/>
                 <w:i/>
                 <w:iCs/>
@@ -10264,22 +10262,7 @@
                 <w:u w:val="none"/>
                 <w:lang w:val="en-US" w:eastAsia="zh-CN" w:bidi="ar"/>
               </w:rPr>
-              <w:t>sr</w:t>
-            </w:r>
-            <w:r>
-              <w:rPr>
-                <w:rFonts w:hint="default" w:ascii="宋体" w:hAnsi="宋体" w:eastAsia="宋体" w:cs="宋体"/>
-                <w:b w:val="0"/>
-                <w:i w:val="0"/>
-                <w:iCs w:val="0"/>
-                <w:color w:val="000000"/>
-                <w:kern w:val="0"/>
-                <w:sz w:val="22"/>
-                <w:szCs w:val="22"/>
-                <w:u w:val="none"/>
-                <w:lang w:val="en-US" w:eastAsia="zh-CN" w:bidi="ar"/>
-              </w:rPr>
-              <w:t>²</w:t>
+              <w:t>p</w:t>
             </w:r>
           </w:p>
         </w:tc>
@@ -10500,7 +10483,7 @@
             </w:pPr>
             <w:r>
               <w:rPr>
-                <w:rFonts w:hint="eastAsia" w:ascii="宋体" w:hAnsi="宋体" w:eastAsia="宋体" w:cs="宋体"/>
+                <w:rFonts w:hint="default" w:ascii="宋体" w:hAnsi="宋体" w:eastAsia="宋体" w:cs="宋体"/>
                 <w:b w:val="0"/>
                 <w:i/>
                 <w:iCs/>
@@ -10511,22 +10494,7 @@
                 <w:u w:val="none"/>
                 <w:lang w:val="en-US" w:eastAsia="zh-CN" w:bidi="ar"/>
               </w:rPr>
-              <w:t>sr</w:t>
-            </w:r>
-            <w:r>
-              <w:rPr>
-                <w:rFonts w:hint="default" w:ascii="宋体" w:hAnsi="宋体" w:eastAsia="宋体" w:cs="宋体"/>
-                <w:b w:val="0"/>
-                <w:i w:val="0"/>
-                <w:iCs w:val="0"/>
-                <w:color w:val="000000"/>
-                <w:kern w:val="0"/>
-                <w:sz w:val="22"/>
-                <w:szCs w:val="22"/>
-                <w:u w:val="none"/>
-                <w:lang w:val="en-US" w:eastAsia="zh-CN" w:bidi="ar"/>
-              </w:rPr>
-              <w:t>²</w:t>
+              <w:t>p</w:t>
             </w:r>
           </w:p>
         </w:tc>
@@ -10747,7 +10715,7 @@
             </w:pPr>
             <w:r>
               <w:rPr>
-                <w:rFonts w:hint="eastAsia" w:ascii="宋体" w:hAnsi="宋体" w:eastAsia="宋体" w:cs="宋体"/>
+                <w:rFonts w:hint="default" w:ascii="宋体" w:hAnsi="宋体" w:eastAsia="宋体" w:cs="宋体"/>
                 <w:b w:val="0"/>
                 <w:i/>
                 <w:iCs/>
@@ -10758,22 +10726,7 @@
                 <w:u w:val="none"/>
                 <w:lang w:val="en-US" w:eastAsia="zh-CN" w:bidi="ar"/>
               </w:rPr>
-              <w:t>sr</w:t>
-            </w:r>
-            <w:r>
-              <w:rPr>
-                <w:rFonts w:hint="default" w:ascii="宋体" w:hAnsi="宋体" w:eastAsia="宋体" w:cs="宋体"/>
-                <w:b w:val="0"/>
-                <w:i w:val="0"/>
-                <w:iCs w:val="0"/>
-                <w:color w:val="000000"/>
-                <w:kern w:val="0"/>
-                <w:sz w:val="22"/>
-                <w:szCs w:val="22"/>
-                <w:u w:val="none"/>
-                <w:lang w:val="en-US" w:eastAsia="zh-CN" w:bidi="ar"/>
-              </w:rPr>
-              <w:t>²</w:t>
+              <w:t>p</w:t>
             </w:r>
           </w:p>
         </w:tc>
@@ -10882,7 +10835,7 @@
         </w:tc>
         <w:tc>
           <w:tcPr>
-            <w:tcW w:w="356" w:type="pct"/>
+            <w:tcW w:w="1009" w:type="dxa"/>
             <w:tcBorders>
               <w:top w:val="single" w:color="auto" w:sz="4" w:space="0"/>
               <w:left w:val="nil"/>
@@ -10911,7 +10864,7 @@
         </w:tc>
         <w:tc>
           <w:tcPr>
-            <w:tcW w:w="389" w:type="pct"/>
+            <w:tcW w:w="1103" w:type="dxa"/>
             <w:tcBorders>
               <w:top w:val="single" w:color="auto" w:sz="4" w:space="0"/>
               <w:left w:val="nil"/>
@@ -10944,39 +10897,22 @@
             <w:r>
               <w:rPr>
                 <w:rFonts w:hint="eastAsia" w:ascii="宋体" w:hAnsi="宋体" w:eastAsia="宋体" w:cs="宋体"/>
-                <w:b w:val="0"/>
-                <w:i w:val="0"/>
-                <w:iCs w:val="0"/>
-                <w:color w:val="000000"/>
-                <w:kern w:val="0"/>
-                <w:sz w:val="22"/>
-                <w:szCs w:val="22"/>
-                <w:u w:val="none"/>
-                <w:lang w:val="en-US" w:eastAsia="zh-CN" w:bidi="ar"/>
-              </w:rPr>
-              <w:t>8.891</w:t>
-            </w:r>
-            <w:r>
-              <w:rPr>
-                <w:rFonts w:hint="eastAsia" w:ascii="宋体" w:hAnsi="宋体" w:eastAsia="宋体" w:cs="宋体"/>
-                <w:b w:val="0"/>
-                <w:i w:val="0"/>
-                <w:iCs w:val="0"/>
-                <w:color w:val="000000"/>
-                <w:kern w:val="0"/>
-                <w:sz w:val="22"/>
-                <w:szCs w:val="22"/>
-                <w:u w:val="none"/>
-                <w:vertAlign w:val="superscript"/>
-                <w:lang w:val="en-US" w:eastAsia="zh-CN" w:bidi="ar"/>
-              </w:rPr>
-              <w:t>***</w:t>
-            </w:r>
-          </w:p>
-        </w:tc>
-        <w:tc>
-          <w:tcPr>
-            <w:tcW w:w="332" w:type="pct"/>
+                <w:i w:val="0"/>
+                <w:iCs w:val="0"/>
+                <w:color w:val="000000"/>
+                <w:kern w:val="0"/>
+                <w:sz w:val="22"/>
+                <w:szCs w:val="22"/>
+                <w:u w:val="none"/>
+                <w:lang w:val="en-US" w:eastAsia="zh-CN" w:bidi="ar"/>
+              </w:rPr>
+              <w:t>11.645</w:t>
+            </w:r>
+          </w:p>
+        </w:tc>
+        <w:tc>
+          <w:tcPr>
+            <w:tcW w:w="941" w:type="dxa"/>
             <w:tcBorders>
               <w:top w:val="single" w:color="auto" w:sz="4" w:space="0"/>
               <w:left w:val="nil"/>
@@ -10989,23 +10925,42 @@
           </w:tcPr>
           <w:p>
             <w:pPr>
-              <w:jc w:val="center"/>
-              <w:rPr>
-                <w:rFonts w:hint="eastAsia" w:ascii="宋体" w:hAnsi="宋体" w:eastAsia="宋体" w:cs="宋体"/>
-                <w:b w:val="0"/>
-                <w:i w:val="0"/>
-                <w:iCs w:val="0"/>
-                <w:color w:val="000000"/>
-                <w:sz w:val="22"/>
-                <w:szCs w:val="22"/>
-                <w:u w:val="none"/>
-              </w:rPr>
-            </w:pPr>
-          </w:p>
-        </w:tc>
-        <w:tc>
-          <w:tcPr>
-            <w:tcW w:w="305" w:type="pct"/>
+              <w:keepNext w:val="0"/>
+              <w:keepLines w:val="0"/>
+              <w:widowControl/>
+              <w:suppressLineNumbers w:val="0"/>
+              <w:jc w:val="center"/>
+              <w:textAlignment w:val="center"/>
+              <w:rPr>
+                <w:rFonts w:hint="eastAsia" w:ascii="宋体" w:hAnsi="宋体" w:eastAsia="宋体" w:cs="宋体"/>
+                <w:b w:val="0"/>
+                <w:i w:val="0"/>
+                <w:iCs w:val="0"/>
+                <w:color w:val="000000"/>
+                <w:sz w:val="22"/>
+                <w:szCs w:val="22"/>
+                <w:u w:val="none"/>
+              </w:rPr>
+            </w:pPr>
+            <w:r>
+              <w:rPr>
+                <w:rFonts w:hint="eastAsia" w:ascii="宋体" w:hAnsi="宋体" w:eastAsia="宋体" w:cs="宋体"/>
+                <w:i w:val="0"/>
+                <w:iCs w:val="0"/>
+                <w:color w:val="000000"/>
+                <w:kern w:val="0"/>
+                <w:sz w:val="22"/>
+                <w:szCs w:val="22"/>
+                <w:u w:val="none"/>
+                <w:lang w:val="en-US" w:eastAsia="zh-CN" w:bidi="ar"/>
+              </w:rPr>
+              <w:t>&lt;0.001</w:t>
+            </w:r>
+          </w:p>
+        </w:tc>
+        <w:tc>
+          <w:tcPr>
+            <w:tcW w:w="870" w:type="dxa"/>
             <w:tcBorders>
               <w:top w:val="single" w:color="auto" w:sz="4" w:space="0"/>
               <w:left w:val="nil"/>
@@ -11063,7 +11018,7 @@
         </w:tc>
         <w:tc>
           <w:tcPr>
-            <w:tcW w:w="356" w:type="pct"/>
+            <w:tcW w:w="1009" w:type="dxa"/>
             <w:tcBorders>
               <w:top w:val="single" w:color="auto" w:sz="4" w:space="0"/>
               <w:left w:val="nil"/>
@@ -11092,7 +11047,7 @@
         </w:tc>
         <w:tc>
           <w:tcPr>
-            <w:tcW w:w="389" w:type="pct"/>
+            <w:tcW w:w="1103" w:type="dxa"/>
             <w:tcBorders>
               <w:top w:val="single" w:color="auto" w:sz="4" w:space="0"/>
               <w:left w:val="nil"/>
@@ -11125,39 +11080,22 @@
             <w:r>
               <w:rPr>
                 <w:rFonts w:hint="eastAsia" w:ascii="宋体" w:hAnsi="宋体" w:eastAsia="宋体" w:cs="宋体"/>
-                <w:b w:val="0"/>
-                <w:i w:val="0"/>
-                <w:iCs w:val="0"/>
-                <w:color w:val="000000"/>
-                <w:kern w:val="0"/>
-                <w:sz w:val="22"/>
-                <w:szCs w:val="22"/>
-                <w:u w:val="none"/>
-                <w:lang w:val="en-US" w:eastAsia="zh-CN" w:bidi="ar"/>
-              </w:rPr>
-              <w:t>3.188</w:t>
-            </w:r>
-            <w:r>
-              <w:rPr>
-                <w:rFonts w:hint="eastAsia" w:ascii="宋体" w:hAnsi="宋体" w:eastAsia="宋体" w:cs="宋体"/>
-                <w:b w:val="0"/>
-                <w:i w:val="0"/>
-                <w:iCs w:val="0"/>
-                <w:color w:val="000000"/>
-                <w:kern w:val="0"/>
-                <w:sz w:val="22"/>
-                <w:szCs w:val="22"/>
-                <w:u w:val="none"/>
-                <w:vertAlign w:val="superscript"/>
-                <w:lang w:val="en-US" w:eastAsia="zh-CN" w:bidi="ar"/>
-              </w:rPr>
-              <w:t>**</w:t>
-            </w:r>
-          </w:p>
-        </w:tc>
-        <w:tc>
-          <w:tcPr>
-            <w:tcW w:w="332" w:type="pct"/>
+                <w:i w:val="0"/>
+                <w:iCs w:val="0"/>
+                <w:color w:val="000000"/>
+                <w:kern w:val="0"/>
+                <w:sz w:val="22"/>
+                <w:szCs w:val="22"/>
+                <w:u w:val="none"/>
+                <w:lang w:val="en-US" w:eastAsia="zh-CN" w:bidi="ar"/>
+              </w:rPr>
+              <w:t>4.642</w:t>
+            </w:r>
+          </w:p>
+        </w:tc>
+        <w:tc>
+          <w:tcPr>
+            <w:tcW w:w="941" w:type="dxa"/>
             <w:tcBorders>
               <w:top w:val="single" w:color="auto" w:sz="4" w:space="0"/>
               <w:left w:val="nil"/>
@@ -11170,23 +11108,42 @@
           </w:tcPr>
           <w:p>
             <w:pPr>
-              <w:jc w:val="center"/>
-              <w:rPr>
-                <w:rFonts w:hint="eastAsia" w:ascii="宋体" w:hAnsi="宋体" w:eastAsia="宋体" w:cs="宋体"/>
-                <w:b w:val="0"/>
-                <w:i w:val="0"/>
-                <w:iCs w:val="0"/>
-                <w:color w:val="000000"/>
-                <w:sz w:val="22"/>
-                <w:szCs w:val="22"/>
-                <w:u w:val="none"/>
-              </w:rPr>
-            </w:pPr>
-          </w:p>
-        </w:tc>
-        <w:tc>
-          <w:tcPr>
-            <w:tcW w:w="305" w:type="pct"/>
+              <w:keepNext w:val="0"/>
+              <w:keepLines w:val="0"/>
+              <w:widowControl/>
+              <w:suppressLineNumbers w:val="0"/>
+              <w:jc w:val="center"/>
+              <w:textAlignment w:val="center"/>
+              <w:rPr>
+                <w:rFonts w:hint="eastAsia" w:ascii="宋体" w:hAnsi="宋体" w:eastAsia="宋体" w:cs="宋体"/>
+                <w:b w:val="0"/>
+                <w:i w:val="0"/>
+                <w:iCs w:val="0"/>
+                <w:color w:val="000000"/>
+                <w:sz w:val="22"/>
+                <w:szCs w:val="22"/>
+                <w:u w:val="none"/>
+              </w:rPr>
+            </w:pPr>
+            <w:r>
+              <w:rPr>
+                <w:rFonts w:hint="eastAsia" w:ascii="宋体" w:hAnsi="宋体" w:eastAsia="宋体" w:cs="宋体"/>
+                <w:i w:val="0"/>
+                <w:iCs w:val="0"/>
+                <w:color w:val="000000"/>
+                <w:kern w:val="0"/>
+                <w:sz w:val="22"/>
+                <w:szCs w:val="22"/>
+                <w:u w:val="none"/>
+                <w:lang w:val="en-US" w:eastAsia="zh-CN" w:bidi="ar"/>
+              </w:rPr>
+              <w:t>&lt;0.001</w:t>
+            </w:r>
+          </w:p>
+        </w:tc>
+        <w:tc>
+          <w:tcPr>
+            <w:tcW w:w="870" w:type="dxa"/>
             <w:tcBorders>
               <w:top w:val="single" w:color="auto" w:sz="4" w:space="0"/>
               <w:left w:val="nil"/>
@@ -11244,7 +11201,7 @@
         </w:tc>
         <w:tc>
           <w:tcPr>
-            <w:tcW w:w="356" w:type="pct"/>
+            <w:tcW w:w="1009" w:type="dxa"/>
             <w:tcBorders>
               <w:top w:val="single" w:color="auto" w:sz="4" w:space="0"/>
               <w:left w:val="nil"/>
@@ -11273,7 +11230,7 @@
         </w:tc>
         <w:tc>
           <w:tcPr>
-            <w:tcW w:w="389" w:type="pct"/>
+            <w:tcW w:w="1103" w:type="dxa"/>
             <w:tcBorders>
               <w:top w:val="single" w:color="auto" w:sz="4" w:space="0"/>
               <w:left w:val="nil"/>
@@ -11306,39 +11263,22 @@
             <w:r>
               <w:rPr>
                 <w:rFonts w:hint="eastAsia" w:ascii="宋体" w:hAnsi="宋体" w:eastAsia="宋体" w:cs="宋体"/>
-                <w:b w:val="0"/>
-                <w:i w:val="0"/>
-                <w:iCs w:val="0"/>
-                <w:color w:val="000000"/>
-                <w:kern w:val="0"/>
-                <w:sz w:val="22"/>
-                <w:szCs w:val="22"/>
-                <w:u w:val="none"/>
-                <w:lang w:val="en-US" w:eastAsia="zh-CN" w:bidi="ar"/>
-              </w:rPr>
-              <w:t>3.137</w:t>
-            </w:r>
-            <w:r>
-              <w:rPr>
-                <w:rFonts w:hint="eastAsia" w:ascii="宋体" w:hAnsi="宋体" w:eastAsia="宋体" w:cs="宋体"/>
-                <w:b w:val="0"/>
-                <w:i w:val="0"/>
-                <w:iCs w:val="0"/>
-                <w:color w:val="000000"/>
-                <w:kern w:val="0"/>
-                <w:sz w:val="22"/>
-                <w:szCs w:val="22"/>
-                <w:u w:val="none"/>
-                <w:vertAlign w:val="superscript"/>
-                <w:lang w:val="en-US" w:eastAsia="zh-CN" w:bidi="ar"/>
-              </w:rPr>
-              <w:t>**</w:t>
-            </w:r>
-          </w:p>
-        </w:tc>
-        <w:tc>
-          <w:tcPr>
-            <w:tcW w:w="332" w:type="pct"/>
+                <w:i w:val="0"/>
+                <w:iCs w:val="0"/>
+                <w:color w:val="000000"/>
+                <w:kern w:val="0"/>
+                <w:sz w:val="22"/>
+                <w:szCs w:val="22"/>
+                <w:u w:val="none"/>
+                <w:lang w:val="en-US" w:eastAsia="zh-CN" w:bidi="ar"/>
+              </w:rPr>
+              <w:t>4.599</w:t>
+            </w:r>
+          </w:p>
+        </w:tc>
+        <w:tc>
+          <w:tcPr>
+            <w:tcW w:w="942" w:type="dxa"/>
             <w:tcBorders>
               <w:top w:val="single" w:color="auto" w:sz="4" w:space="0"/>
               <w:left w:val="nil"/>
@@ -11351,23 +11291,42 @@
           </w:tcPr>
           <w:p>
             <w:pPr>
-              <w:jc w:val="center"/>
-              <w:rPr>
-                <w:rFonts w:hint="eastAsia" w:ascii="宋体" w:hAnsi="宋体" w:eastAsia="宋体" w:cs="宋体"/>
-                <w:b w:val="0"/>
-                <w:i w:val="0"/>
-                <w:iCs w:val="0"/>
-                <w:color w:val="000000"/>
-                <w:sz w:val="22"/>
-                <w:szCs w:val="22"/>
-                <w:u w:val="none"/>
-              </w:rPr>
-            </w:pPr>
-          </w:p>
-        </w:tc>
-        <w:tc>
-          <w:tcPr>
-            <w:tcW w:w="305" w:type="pct"/>
+              <w:keepNext w:val="0"/>
+              <w:keepLines w:val="0"/>
+              <w:widowControl/>
+              <w:suppressLineNumbers w:val="0"/>
+              <w:jc w:val="center"/>
+              <w:textAlignment w:val="center"/>
+              <w:rPr>
+                <w:rFonts w:hint="eastAsia" w:ascii="宋体" w:hAnsi="宋体" w:eastAsia="宋体" w:cs="宋体"/>
+                <w:b w:val="0"/>
+                <w:i w:val="0"/>
+                <w:iCs w:val="0"/>
+                <w:color w:val="000000"/>
+                <w:sz w:val="22"/>
+                <w:szCs w:val="22"/>
+                <w:u w:val="none"/>
+              </w:rPr>
+            </w:pPr>
+            <w:r>
+              <w:rPr>
+                <w:rFonts w:hint="eastAsia" w:ascii="宋体" w:hAnsi="宋体" w:eastAsia="宋体" w:cs="宋体"/>
+                <w:i w:val="0"/>
+                <w:iCs w:val="0"/>
+                <w:color w:val="000000"/>
+                <w:kern w:val="0"/>
+                <w:sz w:val="22"/>
+                <w:szCs w:val="22"/>
+                <w:u w:val="none"/>
+                <w:lang w:val="en-US" w:eastAsia="zh-CN" w:bidi="ar"/>
+              </w:rPr>
+              <w:t>&lt;0.001</w:t>
+            </w:r>
+          </w:p>
+        </w:tc>
+        <w:tc>
+          <w:tcPr>
+            <w:tcW w:w="871" w:type="dxa"/>
             <w:tcBorders>
               <w:top w:val="single" w:color="auto" w:sz="4" w:space="0"/>
               <w:left w:val="nil"/>
@@ -11450,7 +11409,7 @@
         </w:tc>
         <w:tc>
           <w:tcPr>
-            <w:tcW w:w="356" w:type="pct"/>
+            <w:tcW w:w="1009" w:type="dxa"/>
             <w:tcBorders>
               <w:top w:val="nil"/>
               <w:left w:val="nil"/>
@@ -11483,23 +11442,22 @@
             <w:r>
               <w:rPr>
                 <w:rFonts w:hint="eastAsia" w:ascii="宋体" w:hAnsi="宋体" w:eastAsia="宋体" w:cs="宋体"/>
-                <w:b w:val="0"/>
-                <w:i w:val="0"/>
-                <w:iCs w:val="0"/>
-                <w:color w:val="000000"/>
-                <w:kern w:val="0"/>
-                <w:sz w:val="22"/>
-                <w:szCs w:val="22"/>
-                <w:u w:val="none"/>
-                <w:lang w:val="en-US" w:eastAsia="zh-CN" w:bidi="ar"/>
-              </w:rPr>
-              <w:t>0.020</w:t>
-            </w:r>
-          </w:p>
-        </w:tc>
-        <w:tc>
-          <w:tcPr>
-            <w:tcW w:w="389" w:type="pct"/>
+                <w:i w:val="0"/>
+                <w:iCs w:val="0"/>
+                <w:color w:val="000000"/>
+                <w:kern w:val="0"/>
+                <w:sz w:val="22"/>
+                <w:szCs w:val="22"/>
+                <w:u w:val="none"/>
+                <w:lang w:val="en-US" w:eastAsia="zh-CN" w:bidi="ar"/>
+              </w:rPr>
+              <w:t>-0.002</w:t>
+            </w:r>
+          </w:p>
+        </w:tc>
+        <w:tc>
+          <w:tcPr>
+            <w:tcW w:w="1103" w:type="dxa"/>
             <w:tcBorders>
               <w:top w:val="nil"/>
               <w:left w:val="nil"/>
@@ -11532,23 +11490,22 @@
             <w:r>
               <w:rPr>
                 <w:rFonts w:hint="eastAsia" w:ascii="宋体" w:hAnsi="宋体" w:eastAsia="宋体" w:cs="宋体"/>
-                <w:b w:val="0"/>
-                <w:i w:val="0"/>
-                <w:iCs w:val="0"/>
-                <w:color w:val="000000"/>
-                <w:kern w:val="0"/>
-                <w:sz w:val="22"/>
-                <w:szCs w:val="22"/>
-                <w:u w:val="none"/>
-                <w:lang w:val="en-US" w:eastAsia="zh-CN" w:bidi="ar"/>
-              </w:rPr>
-              <w:t>0.363</w:t>
-            </w:r>
-          </w:p>
-        </w:tc>
-        <w:tc>
-          <w:tcPr>
-            <w:tcW w:w="332" w:type="pct"/>
+                <w:i w:val="0"/>
+                <w:iCs w:val="0"/>
+                <w:color w:val="000000"/>
+                <w:kern w:val="0"/>
+                <w:sz w:val="22"/>
+                <w:szCs w:val="22"/>
+                <w:u w:val="none"/>
+                <w:lang w:val="en-US" w:eastAsia="zh-CN" w:bidi="ar"/>
+              </w:rPr>
+              <w:t>-0.03</w:t>
+            </w:r>
+          </w:p>
+        </w:tc>
+        <w:tc>
+          <w:tcPr>
+            <w:tcW w:w="941" w:type="dxa"/>
             <w:tcBorders>
               <w:top w:val="nil"/>
               <w:left w:val="nil"/>
@@ -11580,39 +11537,23 @@
             </w:pPr>
             <w:r>
               <w:rPr>
-                <w:rFonts w:hint="default" w:ascii="宋体" w:hAnsi="宋体" w:eastAsia="宋体" w:cs="宋体"/>
-                <w:b w:val="0"/>
-                <w:i w:val="0"/>
-                <w:iCs w:val="0"/>
-                <w:color w:val="000000"/>
-                <w:kern w:val="0"/>
-                <w:sz w:val="22"/>
-                <w:szCs w:val="22"/>
-                <w:u w:val="none"/>
-                <w:lang w:val="en-US" w:eastAsia="zh-CN" w:bidi="ar"/>
-              </w:rPr>
-              <w:t xml:space="preserve">&lt; </w:t>
-            </w:r>
-            <w:r>
-              <w:rPr>
-                <w:rFonts w:hint="eastAsia" w:ascii="宋体" w:hAnsi="宋体" w:eastAsia="宋体" w:cs="宋体"/>
-                <w:b w:val="0"/>
-                <w:i w:val="0"/>
-                <w:iCs w:val="0"/>
-                <w:color w:val="000000"/>
-                <w:kern w:val="0"/>
-                <w:sz w:val="22"/>
-                <w:szCs w:val="22"/>
-                <w:u w:val="none"/>
-                <w:lang w:val="en-US" w:eastAsia="zh-CN" w:bidi="ar"/>
-              </w:rPr>
-              <w:t>.000</w:t>
-            </w:r>
-          </w:p>
-        </w:tc>
-        <w:tc>
-          <w:tcPr>
-            <w:tcW w:w="305" w:type="pct"/>
+                <w:rFonts w:hint="eastAsia" w:ascii="宋体" w:hAnsi="宋体" w:eastAsia="宋体" w:cs="宋体"/>
+                <w:i w:val="0"/>
+                <w:iCs w:val="0"/>
+                <w:color w:val="000000"/>
+                <w:kern w:val="0"/>
+                <w:sz w:val="22"/>
+                <w:szCs w:val="22"/>
+                <w:u w:val="none"/>
+                <w:lang w:val="en-US" w:eastAsia="zh-CN" w:bidi="ar"/>
+              </w:rPr>
+              <w:t>0.976</w:t>
+            </w:r>
+          </w:p>
+        </w:tc>
+        <w:tc>
+          <w:tcPr>
+            <w:tcW w:w="870" w:type="dxa"/>
             <w:tcBorders>
               <w:top w:val="nil"/>
               <w:left w:val="nil"/>
@@ -11645,7 +11586,6 @@
             <w:r>
               <w:rPr>
                 <w:rFonts w:hint="eastAsia" w:ascii="宋体" w:hAnsi="宋体" w:eastAsia="宋体" w:cs="宋体"/>
-                <w:b w:val="0"/>
                 <w:i w:val="0"/>
                 <w:iCs w:val="0"/>
                 <w:color w:val="000000"/>
@@ -11697,7 +11637,7 @@
         </w:tc>
         <w:tc>
           <w:tcPr>
-            <w:tcW w:w="356" w:type="pct"/>
+            <w:tcW w:w="1009" w:type="dxa"/>
             <w:tcBorders>
               <w:top w:val="nil"/>
               <w:left w:val="nil"/>
@@ -11730,23 +11670,22 @@
             <w:r>
               <w:rPr>
                 <w:rFonts w:hint="eastAsia" w:ascii="宋体" w:hAnsi="宋体" w:eastAsia="宋体" w:cs="宋体"/>
-                <w:b w:val="0"/>
-                <w:i w:val="0"/>
-                <w:iCs w:val="0"/>
-                <w:color w:val="000000"/>
-                <w:kern w:val="0"/>
-                <w:sz w:val="22"/>
-                <w:szCs w:val="22"/>
-                <w:u w:val="none"/>
-                <w:lang w:val="en-US" w:eastAsia="zh-CN" w:bidi="ar"/>
-              </w:rPr>
-              <w:t>0.006</w:t>
-            </w:r>
-          </w:p>
-        </w:tc>
-        <w:tc>
-          <w:tcPr>
-            <w:tcW w:w="389" w:type="pct"/>
+                <w:i w:val="0"/>
+                <w:iCs w:val="0"/>
+                <w:color w:val="000000"/>
+                <w:kern w:val="0"/>
+                <w:sz w:val="22"/>
+                <w:szCs w:val="22"/>
+                <w:u w:val="none"/>
+                <w:lang w:val="en-US" w:eastAsia="zh-CN" w:bidi="ar"/>
+              </w:rPr>
+              <w:t>-0.021</w:t>
+            </w:r>
+          </w:p>
+        </w:tc>
+        <w:tc>
+          <w:tcPr>
+            <w:tcW w:w="1103" w:type="dxa"/>
             <w:tcBorders>
               <w:top w:val="nil"/>
               <w:left w:val="nil"/>
@@ -11779,23 +11718,22 @@
             <w:r>
               <w:rPr>
                 <w:rFonts w:hint="eastAsia" w:ascii="宋体" w:hAnsi="宋体" w:eastAsia="宋体" w:cs="宋体"/>
-                <w:b w:val="0"/>
-                <w:i w:val="0"/>
-                <w:iCs w:val="0"/>
-                <w:color w:val="000000"/>
-                <w:kern w:val="0"/>
-                <w:sz w:val="22"/>
-                <w:szCs w:val="22"/>
-                <w:u w:val="none"/>
-                <w:lang w:val="en-US" w:eastAsia="zh-CN" w:bidi="ar"/>
-              </w:rPr>
-              <w:t>0.102</w:t>
-            </w:r>
-          </w:p>
-        </w:tc>
-        <w:tc>
-          <w:tcPr>
-            <w:tcW w:w="332" w:type="pct"/>
+                <w:i w:val="0"/>
+                <w:iCs w:val="0"/>
+                <w:color w:val="000000"/>
+                <w:kern w:val="0"/>
+                <w:sz w:val="22"/>
+                <w:szCs w:val="22"/>
+                <w:u w:val="none"/>
+                <w:lang w:val="en-US" w:eastAsia="zh-CN" w:bidi="ar"/>
+              </w:rPr>
+              <w:t>-0.396</w:t>
+            </w:r>
+          </w:p>
+        </w:tc>
+        <w:tc>
+          <w:tcPr>
+            <w:tcW w:w="941" w:type="dxa"/>
             <w:tcBorders>
               <w:top w:val="nil"/>
               <w:left w:val="nil"/>
@@ -11827,39 +11765,23 @@
             </w:pPr>
             <w:r>
               <w:rPr>
-                <w:rFonts w:hint="default" w:ascii="宋体" w:hAnsi="宋体" w:eastAsia="宋体" w:cs="宋体"/>
-                <w:b w:val="0"/>
-                <w:i w:val="0"/>
-                <w:iCs w:val="0"/>
-                <w:color w:val="000000"/>
-                <w:kern w:val="0"/>
-                <w:sz w:val="22"/>
-                <w:szCs w:val="22"/>
-                <w:u w:val="none"/>
-                <w:lang w:val="en-US" w:eastAsia="zh-CN" w:bidi="ar"/>
-              </w:rPr>
-              <w:t xml:space="preserve">&lt; </w:t>
-            </w:r>
-            <w:r>
-              <w:rPr>
-                <w:rFonts w:hint="eastAsia" w:ascii="宋体" w:hAnsi="宋体" w:eastAsia="宋体" w:cs="宋体"/>
-                <w:b w:val="0"/>
-                <w:i w:val="0"/>
-                <w:iCs w:val="0"/>
-                <w:color w:val="000000"/>
-                <w:kern w:val="0"/>
-                <w:sz w:val="22"/>
-                <w:szCs w:val="22"/>
-                <w:u w:val="none"/>
-                <w:lang w:val="en-US" w:eastAsia="zh-CN" w:bidi="ar"/>
-              </w:rPr>
-              <w:t>.000</w:t>
-            </w:r>
-          </w:p>
-        </w:tc>
-        <w:tc>
-          <w:tcPr>
-            <w:tcW w:w="305" w:type="pct"/>
+                <w:rFonts w:hint="eastAsia" w:ascii="宋体" w:hAnsi="宋体" w:eastAsia="宋体" w:cs="宋体"/>
+                <w:i w:val="0"/>
+                <w:iCs w:val="0"/>
+                <w:color w:val="000000"/>
+                <w:kern w:val="0"/>
+                <w:sz w:val="22"/>
+                <w:szCs w:val="22"/>
+                <w:u w:val="none"/>
+                <w:lang w:val="en-US" w:eastAsia="zh-CN" w:bidi="ar"/>
+              </w:rPr>
+              <w:t>0.692</w:t>
+            </w:r>
+          </w:p>
+        </w:tc>
+        <w:tc>
+          <w:tcPr>
+            <w:tcW w:w="870" w:type="dxa"/>
             <w:tcBorders>
               <w:top w:val="nil"/>
               <w:left w:val="nil"/>
@@ -11892,7 +11814,6 @@
             <w:r>
               <w:rPr>
                 <w:rFonts w:hint="eastAsia" w:ascii="宋体" w:hAnsi="宋体" w:eastAsia="宋体" w:cs="宋体"/>
-                <w:b w:val="0"/>
                 <w:i w:val="0"/>
                 <w:iCs w:val="0"/>
                 <w:color w:val="000000"/>
@@ -11944,7 +11865,7 @@
         </w:tc>
         <w:tc>
           <w:tcPr>
-            <w:tcW w:w="356" w:type="pct"/>
+            <w:tcW w:w="1009" w:type="dxa"/>
             <w:tcBorders>
               <w:top w:val="nil"/>
               <w:left w:val="nil"/>
@@ -11977,23 +11898,22 @@
             <w:r>
               <w:rPr>
                 <w:rFonts w:hint="eastAsia" w:ascii="宋体" w:hAnsi="宋体" w:eastAsia="宋体" w:cs="宋体"/>
-                <w:b w:val="0"/>
-                <w:i w:val="0"/>
-                <w:iCs w:val="0"/>
-                <w:color w:val="000000"/>
-                <w:kern w:val="0"/>
-                <w:sz w:val="22"/>
-                <w:szCs w:val="22"/>
-                <w:u w:val="none"/>
-                <w:lang w:val="en-US" w:eastAsia="zh-CN" w:bidi="ar"/>
-              </w:rPr>
-              <w:t>0.003</w:t>
-            </w:r>
-          </w:p>
-        </w:tc>
-        <w:tc>
-          <w:tcPr>
-            <w:tcW w:w="389" w:type="pct"/>
+                <w:i w:val="0"/>
+                <w:iCs w:val="0"/>
+                <w:color w:val="000000"/>
+                <w:kern w:val="0"/>
+                <w:sz w:val="22"/>
+                <w:szCs w:val="22"/>
+                <w:u w:val="none"/>
+                <w:lang w:val="en-US" w:eastAsia="zh-CN" w:bidi="ar"/>
+              </w:rPr>
+              <w:t>-0.024</w:t>
+            </w:r>
+          </w:p>
+        </w:tc>
+        <w:tc>
+          <w:tcPr>
+            <w:tcW w:w="1103" w:type="dxa"/>
             <w:tcBorders>
               <w:top w:val="nil"/>
               <w:left w:val="nil"/>
@@ -12026,23 +11946,22 @@
             <w:r>
               <w:rPr>
                 <w:rFonts w:hint="eastAsia" w:ascii="宋体" w:hAnsi="宋体" w:eastAsia="宋体" w:cs="宋体"/>
-                <w:b w:val="0"/>
-                <w:i w:val="0"/>
-                <w:iCs w:val="0"/>
-                <w:color w:val="000000"/>
-                <w:kern w:val="0"/>
-                <w:sz w:val="22"/>
-                <w:szCs w:val="22"/>
-                <w:u w:val="none"/>
-                <w:lang w:val="en-US" w:eastAsia="zh-CN" w:bidi="ar"/>
-              </w:rPr>
-              <w:t>0.047</w:t>
-            </w:r>
-          </w:p>
-        </w:tc>
-        <w:tc>
-          <w:tcPr>
-            <w:tcW w:w="332" w:type="pct"/>
+                <w:i w:val="0"/>
+                <w:iCs w:val="0"/>
+                <w:color w:val="000000"/>
+                <w:kern w:val="0"/>
+                <w:sz w:val="22"/>
+                <w:szCs w:val="22"/>
+                <w:u w:val="none"/>
+                <w:lang w:val="en-US" w:eastAsia="zh-CN" w:bidi="ar"/>
+              </w:rPr>
+              <w:t>-0.448</w:t>
+            </w:r>
+          </w:p>
+        </w:tc>
+        <w:tc>
+          <w:tcPr>
+            <w:tcW w:w="942" w:type="dxa"/>
             <w:tcBorders>
               <w:top w:val="nil"/>
               <w:left w:val="nil"/>
@@ -12074,39 +11993,23 @@
             </w:pPr>
             <w:r>
               <w:rPr>
-                <w:rFonts w:hint="default" w:ascii="宋体" w:hAnsi="宋体" w:eastAsia="宋体" w:cs="宋体"/>
-                <w:b w:val="0"/>
-                <w:i w:val="0"/>
-                <w:iCs w:val="0"/>
-                <w:color w:val="000000"/>
-                <w:kern w:val="0"/>
-                <w:sz w:val="22"/>
-                <w:szCs w:val="22"/>
-                <w:u w:val="none"/>
-                <w:lang w:val="en-US" w:eastAsia="zh-CN" w:bidi="ar"/>
-              </w:rPr>
-              <w:t xml:space="preserve">&lt; </w:t>
-            </w:r>
-            <w:r>
-              <w:rPr>
-                <w:rFonts w:hint="eastAsia" w:ascii="宋体" w:hAnsi="宋体" w:eastAsia="宋体" w:cs="宋体"/>
-                <w:b w:val="0"/>
-                <w:i w:val="0"/>
-                <w:iCs w:val="0"/>
-                <w:color w:val="000000"/>
-                <w:kern w:val="0"/>
-                <w:sz w:val="22"/>
-                <w:szCs w:val="22"/>
-                <w:u w:val="none"/>
-                <w:lang w:val="en-US" w:eastAsia="zh-CN" w:bidi="ar"/>
-              </w:rPr>
-              <w:t>.000</w:t>
-            </w:r>
-          </w:p>
-        </w:tc>
-        <w:tc>
-          <w:tcPr>
-            <w:tcW w:w="305" w:type="pct"/>
+                <w:rFonts w:hint="eastAsia" w:ascii="宋体" w:hAnsi="宋体" w:eastAsia="宋体" w:cs="宋体"/>
+                <w:i w:val="0"/>
+                <w:iCs w:val="0"/>
+                <w:color w:val="000000"/>
+                <w:kern w:val="0"/>
+                <w:sz w:val="22"/>
+                <w:szCs w:val="22"/>
+                <w:u w:val="none"/>
+                <w:lang w:val="en-US" w:eastAsia="zh-CN" w:bidi="ar"/>
+              </w:rPr>
+              <w:t>0.654</w:t>
+            </w:r>
+          </w:p>
+        </w:tc>
+        <w:tc>
+          <w:tcPr>
+            <w:tcW w:w="871" w:type="dxa"/>
             <w:tcBorders>
               <w:top w:val="nil"/>
               <w:left w:val="nil"/>
@@ -12139,7 +12042,6 @@
             <w:r>
               <w:rPr>
                 <w:rFonts w:hint="eastAsia" w:ascii="宋体" w:hAnsi="宋体" w:eastAsia="宋体" w:cs="宋体"/>
-                <w:b w:val="0"/>
                 <w:i w:val="0"/>
                 <w:iCs w:val="0"/>
                 <w:color w:val="000000"/>
@@ -12209,7 +12111,7 @@
         </w:tc>
         <w:tc>
           <w:tcPr>
-            <w:tcW w:w="356" w:type="pct"/>
+            <w:tcW w:w="1009" w:type="dxa"/>
             <w:tcBorders>
               <w:top w:val="nil"/>
               <w:left w:val="nil"/>
@@ -12242,7 +12144,6 @@
             <w:r>
               <w:rPr>
                 <w:rFonts w:hint="eastAsia" w:ascii="宋体" w:hAnsi="宋体" w:eastAsia="宋体" w:cs="宋体"/>
-                <w:b w:val="0"/>
                 <w:i w:val="0"/>
                 <w:iCs w:val="0"/>
                 <w:color w:val="000000"/>
@@ -12258,7 +12159,7 @@
         </w:tc>
         <w:tc>
           <w:tcPr>
-            <w:tcW w:w="389" w:type="pct"/>
+            <w:tcW w:w="1103" w:type="dxa"/>
             <w:tcBorders>
               <w:top w:val="nil"/>
               <w:left w:val="nil"/>
@@ -12291,23 +12192,22 @@
             <w:r>
               <w:rPr>
                 <w:rFonts w:hint="eastAsia" w:ascii="宋体" w:hAnsi="宋体" w:eastAsia="宋体" w:cs="宋体"/>
-                <w:b w:val="0"/>
-                <w:i w:val="0"/>
-                <w:iCs w:val="0"/>
-                <w:color w:val="000000"/>
-                <w:kern w:val="0"/>
-                <w:sz w:val="22"/>
-                <w:szCs w:val="22"/>
-                <w:u w:val="none"/>
-                <w:lang w:val="en-US" w:eastAsia="zh-CN" w:bidi="ar"/>
-              </w:rPr>
-              <w:t>-0.157</w:t>
-            </w:r>
-          </w:p>
-        </w:tc>
-        <w:tc>
-          <w:tcPr>
-            <w:tcW w:w="332" w:type="pct"/>
+                <w:i w:val="0"/>
+                <w:iCs w:val="0"/>
+                <w:color w:val="000000"/>
+                <w:kern w:val="0"/>
+                <w:sz w:val="22"/>
+                <w:szCs w:val="22"/>
+                <w:u w:val="none"/>
+                <w:lang w:val="en-US" w:eastAsia="zh-CN" w:bidi="ar"/>
+              </w:rPr>
+              <w:t>-0.155</w:t>
+            </w:r>
+          </w:p>
+        </w:tc>
+        <w:tc>
+          <w:tcPr>
+            <w:tcW w:w="941" w:type="dxa"/>
             <w:tcBorders>
               <w:top w:val="nil"/>
               <w:left w:val="nil"/>
@@ -12339,39 +12239,23 @@
             </w:pPr>
             <w:r>
               <w:rPr>
-                <w:rFonts w:hint="default" w:ascii="宋体" w:hAnsi="宋体" w:eastAsia="宋体" w:cs="宋体"/>
-                <w:b w:val="0"/>
-                <w:i w:val="0"/>
-                <w:iCs w:val="0"/>
-                <w:color w:val="000000"/>
-                <w:kern w:val="0"/>
-                <w:sz w:val="22"/>
-                <w:szCs w:val="22"/>
-                <w:u w:val="none"/>
-                <w:lang w:val="en-US" w:eastAsia="zh-CN" w:bidi="ar"/>
-              </w:rPr>
-              <w:t xml:space="preserve">&lt; </w:t>
-            </w:r>
-            <w:r>
-              <w:rPr>
-                <w:rFonts w:hint="eastAsia" w:ascii="宋体" w:hAnsi="宋体" w:eastAsia="宋体" w:cs="宋体"/>
-                <w:b w:val="0"/>
-                <w:i w:val="0"/>
-                <w:iCs w:val="0"/>
-                <w:color w:val="000000"/>
-                <w:kern w:val="0"/>
-                <w:sz w:val="22"/>
-                <w:szCs w:val="22"/>
-                <w:u w:val="none"/>
-                <w:lang w:val="en-US" w:eastAsia="zh-CN" w:bidi="ar"/>
-              </w:rPr>
-              <w:t>.000</w:t>
-            </w:r>
-          </w:p>
-        </w:tc>
-        <w:tc>
-          <w:tcPr>
-            <w:tcW w:w="305" w:type="pct"/>
+                <w:rFonts w:hint="eastAsia" w:ascii="宋体" w:hAnsi="宋体" w:eastAsia="宋体" w:cs="宋体"/>
+                <w:i w:val="0"/>
+                <w:iCs w:val="0"/>
+                <w:color w:val="000000"/>
+                <w:kern w:val="0"/>
+                <w:sz w:val="22"/>
+                <w:szCs w:val="22"/>
+                <w:u w:val="none"/>
+                <w:lang w:val="en-US" w:eastAsia="zh-CN" w:bidi="ar"/>
+              </w:rPr>
+              <w:t>0.877</w:t>
+            </w:r>
+          </w:p>
+        </w:tc>
+        <w:tc>
+          <w:tcPr>
+            <w:tcW w:w="870" w:type="dxa"/>
             <w:tcBorders>
               <w:top w:val="nil"/>
               <w:left w:val="nil"/>
@@ -12404,18 +12288,19 @@
             <w:r>
               <w:rPr>
                 <w:rFonts w:hint="eastAsia" w:ascii="宋体" w:hAnsi="宋体" w:eastAsia="宋体" w:cs="宋体"/>
-                <w:b w:val="0"/>
-                <w:i w:val="0"/>
-                <w:iCs w:val="0"/>
-                <w:color w:val="000000"/>
-                <w:kern w:val="0"/>
-                <w:sz w:val="22"/>
-                <w:szCs w:val="22"/>
-                <w:u w:val="none"/>
-                <w:lang w:val="en-US" w:eastAsia="zh-CN" w:bidi="ar"/>
-              </w:rPr>
-              <w:t>1.820</w:t>
-            </w:r>
+                <w:i w:val="0"/>
+                <w:iCs w:val="0"/>
+                <w:color w:val="000000"/>
+                <w:kern w:val="0"/>
+                <w:sz w:val="22"/>
+                <w:szCs w:val="22"/>
+                <w:u w:val="none"/>
+                <w:lang w:val="en-US" w:eastAsia="zh-CN" w:bidi="ar"/>
+              </w:rPr>
+              <w:t>1.82</w:t>
+            </w:r>
+            <w:bookmarkStart w:id="0" w:name="_GoBack"/>
+            <w:bookmarkEnd w:id="0"/>
           </w:p>
         </w:tc>
         <w:tc>
@@ -12456,7 +12341,7 @@
         </w:tc>
         <w:tc>
           <w:tcPr>
-            <w:tcW w:w="356" w:type="pct"/>
+            <w:tcW w:w="1009" w:type="dxa"/>
             <w:tcBorders>
               <w:top w:val="nil"/>
               <w:left w:val="nil"/>
@@ -12489,23 +12374,22 @@
             <w:r>
               <w:rPr>
                 <w:rFonts w:hint="eastAsia" w:ascii="宋体" w:hAnsi="宋体" w:eastAsia="宋体" w:cs="宋体"/>
-                <w:b w:val="0"/>
-                <w:i w:val="0"/>
-                <w:iCs w:val="0"/>
-                <w:color w:val="000000"/>
-                <w:kern w:val="0"/>
-                <w:sz w:val="22"/>
-                <w:szCs w:val="22"/>
-                <w:u w:val="none"/>
-                <w:lang w:val="en-US" w:eastAsia="zh-CN" w:bidi="ar"/>
-              </w:rPr>
-              <w:t>0.009</w:t>
-            </w:r>
-          </w:p>
-        </w:tc>
-        <w:tc>
-          <w:tcPr>
-            <w:tcW w:w="389" w:type="pct"/>
+                <w:i w:val="0"/>
+                <w:iCs w:val="0"/>
+                <w:color w:val="000000"/>
+                <w:kern w:val="0"/>
+                <w:sz w:val="22"/>
+                <w:szCs w:val="22"/>
+                <w:u w:val="none"/>
+                <w:lang w:val="en-US" w:eastAsia="zh-CN" w:bidi="ar"/>
+              </w:rPr>
+              <w:t>0.016</w:t>
+            </w:r>
+          </w:p>
+        </w:tc>
+        <w:tc>
+          <w:tcPr>
+            <w:tcW w:w="1103" w:type="dxa"/>
             <w:tcBorders>
               <w:top w:val="nil"/>
               <w:left w:val="nil"/>
@@ -12538,23 +12422,22 @@
             <w:r>
               <w:rPr>
                 <w:rFonts w:hint="eastAsia" w:ascii="宋体" w:hAnsi="宋体" w:eastAsia="宋体" w:cs="宋体"/>
-                <w:b w:val="0"/>
-                <w:i w:val="0"/>
-                <w:iCs w:val="0"/>
-                <w:color w:val="000000"/>
-                <w:kern w:val="0"/>
-                <w:sz w:val="22"/>
-                <w:szCs w:val="22"/>
-                <w:u w:val="none"/>
-                <w:lang w:val="en-US" w:eastAsia="zh-CN" w:bidi="ar"/>
-              </w:rPr>
-              <w:t>0.132</w:t>
-            </w:r>
-          </w:p>
-        </w:tc>
-        <w:tc>
-          <w:tcPr>
-            <w:tcW w:w="332" w:type="pct"/>
+                <w:i w:val="0"/>
+                <w:iCs w:val="0"/>
+                <w:color w:val="000000"/>
+                <w:kern w:val="0"/>
+                <w:sz w:val="22"/>
+                <w:szCs w:val="22"/>
+                <w:u w:val="none"/>
+                <w:lang w:val="en-US" w:eastAsia="zh-CN" w:bidi="ar"/>
+              </w:rPr>
+              <w:t>0.243</w:t>
+            </w:r>
+          </w:p>
+        </w:tc>
+        <w:tc>
+          <w:tcPr>
+            <w:tcW w:w="941" w:type="dxa"/>
             <w:tcBorders>
               <w:top w:val="nil"/>
               <w:left w:val="nil"/>
@@ -12586,39 +12469,23 @@
             </w:pPr>
             <w:r>
               <w:rPr>
-                <w:rFonts w:hint="default" w:ascii="宋体" w:hAnsi="宋体" w:eastAsia="宋体" w:cs="宋体"/>
-                <w:b w:val="0"/>
-                <w:i w:val="0"/>
-                <w:iCs w:val="0"/>
-                <w:color w:val="000000"/>
-                <w:kern w:val="0"/>
-                <w:sz w:val="22"/>
-                <w:szCs w:val="22"/>
-                <w:u w:val="none"/>
-                <w:lang w:val="en-US" w:eastAsia="zh-CN" w:bidi="ar"/>
-              </w:rPr>
-              <w:t xml:space="preserve">&lt; </w:t>
-            </w:r>
-            <w:r>
-              <w:rPr>
-                <w:rFonts w:hint="eastAsia" w:ascii="宋体" w:hAnsi="宋体" w:eastAsia="宋体" w:cs="宋体"/>
-                <w:b w:val="0"/>
-                <w:i w:val="0"/>
-                <w:iCs w:val="0"/>
-                <w:color w:val="000000"/>
-                <w:kern w:val="0"/>
-                <w:sz w:val="22"/>
-                <w:szCs w:val="22"/>
-                <w:u w:val="none"/>
-                <w:lang w:val="en-US" w:eastAsia="zh-CN" w:bidi="ar"/>
-              </w:rPr>
-              <w:t>.000</w:t>
-            </w:r>
-          </w:p>
-        </w:tc>
-        <w:tc>
-          <w:tcPr>
-            <w:tcW w:w="305" w:type="pct"/>
+                <w:rFonts w:hint="eastAsia" w:ascii="宋体" w:hAnsi="宋体" w:eastAsia="宋体" w:cs="宋体"/>
+                <w:i w:val="0"/>
+                <w:iCs w:val="0"/>
+                <w:color w:val="000000"/>
+                <w:kern w:val="0"/>
+                <w:sz w:val="22"/>
+                <w:szCs w:val="22"/>
+                <w:u w:val="none"/>
+                <w:lang w:val="en-US" w:eastAsia="zh-CN" w:bidi="ar"/>
+              </w:rPr>
+              <w:t>0.808</w:t>
+            </w:r>
+          </w:p>
+        </w:tc>
+        <w:tc>
+          <w:tcPr>
+            <w:tcW w:w="870" w:type="dxa"/>
             <w:tcBorders>
               <w:top w:val="nil"/>
               <w:left w:val="nil"/>
@@ -12651,7 +12518,6 @@
             <w:r>
               <w:rPr>
                 <w:rFonts w:hint="eastAsia" w:ascii="宋体" w:hAnsi="宋体" w:eastAsia="宋体" w:cs="宋体"/>
-                <w:b w:val="0"/>
                 <w:i w:val="0"/>
                 <w:iCs w:val="0"/>
                 <w:color w:val="000000"/>
@@ -12703,7 +12569,7 @@
         </w:tc>
         <w:tc>
           <w:tcPr>
-            <w:tcW w:w="356" w:type="pct"/>
+            <w:tcW w:w="1009" w:type="dxa"/>
             <w:tcBorders>
               <w:top w:val="nil"/>
               <w:left w:val="nil"/>
@@ -12736,23 +12602,22 @@
             <w:r>
               <w:rPr>
                 <w:rFonts w:hint="eastAsia" w:ascii="宋体" w:hAnsi="宋体" w:eastAsia="宋体" w:cs="宋体"/>
-                <w:b w:val="0"/>
-                <w:i w:val="0"/>
-                <w:iCs w:val="0"/>
-                <w:color w:val="000000"/>
-                <w:kern w:val="0"/>
-                <w:sz w:val="22"/>
-                <w:szCs w:val="22"/>
-                <w:u w:val="none"/>
-                <w:lang w:val="en-US" w:eastAsia="zh-CN" w:bidi="ar"/>
-              </w:rPr>
-              <w:t>0.005</w:t>
-            </w:r>
-          </w:p>
-        </w:tc>
-        <w:tc>
-          <w:tcPr>
-            <w:tcW w:w="389" w:type="pct"/>
+                <w:i w:val="0"/>
+                <w:iCs w:val="0"/>
+                <w:color w:val="000000"/>
+                <w:kern w:val="0"/>
+                <w:sz w:val="22"/>
+                <w:szCs w:val="22"/>
+                <w:u w:val="none"/>
+                <w:lang w:val="en-US" w:eastAsia="zh-CN" w:bidi="ar"/>
+              </w:rPr>
+              <w:t>0.013</w:t>
+            </w:r>
+          </w:p>
+        </w:tc>
+        <w:tc>
+          <w:tcPr>
+            <w:tcW w:w="1103" w:type="dxa"/>
             <w:tcBorders>
               <w:top w:val="nil"/>
               <w:left w:val="nil"/>
@@ -12785,23 +12650,22 @@
             <w:r>
               <w:rPr>
                 <w:rFonts w:hint="eastAsia" w:ascii="宋体" w:hAnsi="宋体" w:eastAsia="宋体" w:cs="宋体"/>
-                <w:b w:val="0"/>
-                <w:i w:val="0"/>
-                <w:iCs w:val="0"/>
-                <w:color w:val="000000"/>
-                <w:kern w:val="0"/>
-                <w:sz w:val="22"/>
-                <w:szCs w:val="22"/>
-                <w:u w:val="none"/>
-                <w:lang w:val="en-US" w:eastAsia="zh-CN" w:bidi="ar"/>
-              </w:rPr>
-              <w:t>0.077</w:t>
-            </w:r>
-          </w:p>
-        </w:tc>
-        <w:tc>
-          <w:tcPr>
-            <w:tcW w:w="332" w:type="pct"/>
+                <w:i w:val="0"/>
+                <w:iCs w:val="0"/>
+                <w:color w:val="000000"/>
+                <w:kern w:val="0"/>
+                <w:sz w:val="22"/>
+                <w:szCs w:val="22"/>
+                <w:u w:val="none"/>
+                <w:lang w:val="en-US" w:eastAsia="zh-CN" w:bidi="ar"/>
+              </w:rPr>
+              <w:t>0.193</w:t>
+            </w:r>
+          </w:p>
+        </w:tc>
+        <w:tc>
+          <w:tcPr>
+            <w:tcW w:w="942" w:type="dxa"/>
             <w:tcBorders>
               <w:top w:val="nil"/>
               <w:left w:val="nil"/>
@@ -12833,39 +12697,23 @@
             </w:pPr>
             <w:r>
               <w:rPr>
-                <w:rFonts w:hint="default" w:ascii="宋体" w:hAnsi="宋体" w:eastAsia="宋体" w:cs="宋体"/>
-                <w:b w:val="0"/>
-                <w:i w:val="0"/>
-                <w:iCs w:val="0"/>
-                <w:color w:val="000000"/>
-                <w:kern w:val="0"/>
-                <w:sz w:val="22"/>
-                <w:szCs w:val="22"/>
-                <w:u w:val="none"/>
-                <w:lang w:val="en-US" w:eastAsia="zh-CN" w:bidi="ar"/>
-              </w:rPr>
-              <w:t xml:space="preserve">&lt; </w:t>
-            </w:r>
-            <w:r>
-              <w:rPr>
-                <w:rFonts w:hint="eastAsia" w:ascii="宋体" w:hAnsi="宋体" w:eastAsia="宋体" w:cs="宋体"/>
-                <w:b w:val="0"/>
-                <w:i w:val="0"/>
-                <w:iCs w:val="0"/>
-                <w:color w:val="000000"/>
-                <w:kern w:val="0"/>
-                <w:sz w:val="22"/>
-                <w:szCs w:val="22"/>
-                <w:u w:val="none"/>
-                <w:lang w:val="en-US" w:eastAsia="zh-CN" w:bidi="ar"/>
-              </w:rPr>
-              <w:t>.000</w:t>
-            </w:r>
-          </w:p>
-        </w:tc>
-        <w:tc>
-          <w:tcPr>
-            <w:tcW w:w="305" w:type="pct"/>
+                <w:rFonts w:hint="eastAsia" w:ascii="宋体" w:hAnsi="宋体" w:eastAsia="宋体" w:cs="宋体"/>
+                <w:i w:val="0"/>
+                <w:iCs w:val="0"/>
+                <w:color w:val="000000"/>
+                <w:kern w:val="0"/>
+                <w:sz w:val="22"/>
+                <w:szCs w:val="22"/>
+                <w:u w:val="none"/>
+                <w:lang w:val="en-US" w:eastAsia="zh-CN" w:bidi="ar"/>
+              </w:rPr>
+              <w:t>0.847</w:t>
+            </w:r>
+          </w:p>
+        </w:tc>
+        <w:tc>
+          <w:tcPr>
+            <w:tcW w:w="871" w:type="dxa"/>
             <w:tcBorders>
               <w:top w:val="nil"/>
               <w:left w:val="nil"/>
@@ -12898,7 +12746,6 @@
             <w:r>
               <w:rPr>
                 <w:rFonts w:hint="eastAsia" w:ascii="宋体" w:hAnsi="宋体" w:eastAsia="宋体" w:cs="宋体"/>
-                <w:b w:val="0"/>
                 <w:i w:val="0"/>
                 <w:iCs w:val="0"/>
                 <w:color w:val="000000"/>
@@ -12968,7 +12815,7 @@
         </w:tc>
         <w:tc>
           <w:tcPr>
-            <w:tcW w:w="356" w:type="pct"/>
+            <w:tcW w:w="1009" w:type="dxa"/>
             <w:tcBorders>
               <w:top w:val="nil"/>
               <w:left w:val="nil"/>
@@ -13001,23 +12848,22 @@
             <w:r>
               <w:rPr>
                 <w:rFonts w:hint="eastAsia" w:ascii="宋体" w:hAnsi="宋体" w:eastAsia="宋体" w:cs="宋体"/>
-                <w:b w:val="0"/>
-                <w:i w:val="0"/>
-                <w:iCs w:val="0"/>
-                <w:color w:val="000000"/>
-                <w:kern w:val="0"/>
-                <w:sz w:val="22"/>
-                <w:szCs w:val="22"/>
-                <w:u w:val="none"/>
-                <w:lang w:val="en-US" w:eastAsia="zh-CN" w:bidi="ar"/>
-              </w:rPr>
-              <w:t>-0.016</w:t>
-            </w:r>
-          </w:p>
-        </w:tc>
-        <w:tc>
-          <w:tcPr>
-            <w:tcW w:w="389" w:type="pct"/>
+                <w:i w:val="0"/>
+                <w:iCs w:val="0"/>
+                <w:color w:val="000000"/>
+                <w:kern w:val="0"/>
+                <w:sz w:val="22"/>
+                <w:szCs w:val="22"/>
+                <w:u w:val="none"/>
+                <w:lang w:val="en-US" w:eastAsia="zh-CN" w:bidi="ar"/>
+              </w:rPr>
+              <w:t>-0.074</w:t>
+            </w:r>
+          </w:p>
+        </w:tc>
+        <w:tc>
+          <w:tcPr>
+            <w:tcW w:w="1103" w:type="dxa"/>
             <w:tcBorders>
               <w:top w:val="nil"/>
               <w:left w:val="nil"/>
@@ -13050,23 +12896,22 @@
             <w:r>
               <w:rPr>
                 <w:rFonts w:hint="eastAsia" w:ascii="宋体" w:hAnsi="宋体" w:eastAsia="宋体" w:cs="宋体"/>
-                <w:b w:val="0"/>
-                <w:i w:val="0"/>
-                <w:iCs w:val="0"/>
-                <w:color w:val="000000"/>
-                <w:kern w:val="0"/>
-                <w:sz w:val="22"/>
-                <w:szCs w:val="22"/>
-                <w:u w:val="none"/>
-                <w:lang w:val="en-US" w:eastAsia="zh-CN" w:bidi="ar"/>
-              </w:rPr>
-              <w:t>-0.197</w:t>
-            </w:r>
-          </w:p>
-        </w:tc>
-        <w:tc>
-          <w:tcPr>
-            <w:tcW w:w="332" w:type="pct"/>
+                <w:i w:val="0"/>
+                <w:iCs w:val="0"/>
+                <w:color w:val="000000"/>
+                <w:kern w:val="0"/>
+                <w:sz w:val="22"/>
+                <w:szCs w:val="22"/>
+                <w:u w:val="none"/>
+                <w:lang w:val="en-US" w:eastAsia="zh-CN" w:bidi="ar"/>
+              </w:rPr>
+              <w:t>-0.913</w:t>
+            </w:r>
+          </w:p>
+        </w:tc>
+        <w:tc>
+          <w:tcPr>
+            <w:tcW w:w="941" w:type="dxa"/>
             <w:tcBorders>
               <w:top w:val="nil"/>
               <w:left w:val="nil"/>
@@ -13098,39 +12943,23 @@
             </w:pPr>
             <w:r>
               <w:rPr>
-                <w:rFonts w:hint="default" w:ascii="宋体" w:hAnsi="宋体" w:eastAsia="宋体" w:cs="宋体"/>
-                <w:b w:val="0"/>
-                <w:i w:val="0"/>
-                <w:iCs w:val="0"/>
-                <w:color w:val="000000"/>
-                <w:kern w:val="0"/>
-                <w:sz w:val="22"/>
-                <w:szCs w:val="22"/>
-                <w:u w:val="none"/>
-                <w:lang w:val="en-US" w:eastAsia="zh-CN" w:bidi="ar"/>
-              </w:rPr>
-              <w:t xml:space="preserve">&lt; </w:t>
-            </w:r>
-            <w:r>
-              <w:rPr>
-                <w:rFonts w:hint="eastAsia" w:ascii="宋体" w:hAnsi="宋体" w:eastAsia="宋体" w:cs="宋体"/>
-                <w:b w:val="0"/>
-                <w:i w:val="0"/>
-                <w:iCs w:val="0"/>
-                <w:color w:val="000000"/>
-                <w:kern w:val="0"/>
-                <w:sz w:val="22"/>
-                <w:szCs w:val="22"/>
-                <w:u w:val="none"/>
-                <w:lang w:val="en-US" w:eastAsia="zh-CN" w:bidi="ar"/>
-              </w:rPr>
-              <w:t>.000</w:t>
-            </w:r>
-          </w:p>
-        </w:tc>
-        <w:tc>
-          <w:tcPr>
-            <w:tcW w:w="305" w:type="pct"/>
+                <w:rFonts w:hint="eastAsia" w:ascii="宋体" w:hAnsi="宋体" w:eastAsia="宋体" w:cs="宋体"/>
+                <w:i w:val="0"/>
+                <w:iCs w:val="0"/>
+                <w:color w:val="000000"/>
+                <w:kern w:val="0"/>
+                <w:sz w:val="22"/>
+                <w:szCs w:val="22"/>
+                <w:u w:val="none"/>
+                <w:lang w:val="en-US" w:eastAsia="zh-CN" w:bidi="ar"/>
+              </w:rPr>
+              <w:t>0.362</w:t>
+            </w:r>
+          </w:p>
+        </w:tc>
+        <w:tc>
+          <w:tcPr>
+            <w:tcW w:w="870" w:type="dxa"/>
             <w:tcBorders>
               <w:top w:val="nil"/>
               <w:left w:val="nil"/>
@@ -13163,7 +12992,6 @@
             <w:r>
               <w:rPr>
                 <w:rFonts w:hint="eastAsia" w:ascii="宋体" w:hAnsi="宋体" w:eastAsia="宋体" w:cs="宋体"/>
-                <w:b w:val="0"/>
                 <w:i w:val="0"/>
                 <w:iCs w:val="0"/>
                 <w:color w:val="000000"/>
@@ -13215,7 +13043,7 @@
         </w:tc>
         <w:tc>
           <w:tcPr>
-            <w:tcW w:w="356" w:type="pct"/>
+            <w:tcW w:w="1009" w:type="dxa"/>
             <w:tcBorders>
               <w:top w:val="nil"/>
               <w:left w:val="nil"/>
@@ -13248,23 +13076,22 @@
             <w:r>
               <w:rPr>
                 <w:rFonts w:hint="eastAsia" w:ascii="宋体" w:hAnsi="宋体" w:eastAsia="宋体" w:cs="宋体"/>
-                <w:b w:val="0"/>
-                <w:i w:val="0"/>
-                <w:iCs w:val="0"/>
-                <w:color w:val="000000"/>
-                <w:kern w:val="0"/>
-                <w:sz w:val="22"/>
-                <w:szCs w:val="22"/>
-                <w:u w:val="none"/>
-                <w:lang w:val="en-US" w:eastAsia="zh-CN" w:bidi="ar"/>
-              </w:rPr>
-              <w:t>-0.011</w:t>
-            </w:r>
-          </w:p>
-        </w:tc>
-        <w:tc>
-          <w:tcPr>
-            <w:tcW w:w="389" w:type="pct"/>
+                <w:i w:val="0"/>
+                <w:iCs w:val="0"/>
+                <w:color w:val="000000"/>
+                <w:kern w:val="0"/>
+                <w:sz w:val="22"/>
+                <w:szCs w:val="22"/>
+                <w:u w:val="none"/>
+                <w:lang w:val="en-US" w:eastAsia="zh-CN" w:bidi="ar"/>
+              </w:rPr>
+              <w:t>-0.072</w:t>
+            </w:r>
+          </w:p>
+        </w:tc>
+        <w:tc>
+          <w:tcPr>
+            <w:tcW w:w="1103" w:type="dxa"/>
             <w:tcBorders>
               <w:top w:val="nil"/>
               <w:left w:val="nil"/>
@@ -13297,23 +13124,22 @@
             <w:r>
               <w:rPr>
                 <w:rFonts w:hint="eastAsia" w:ascii="宋体" w:hAnsi="宋体" w:eastAsia="宋体" w:cs="宋体"/>
-                <w:b w:val="0"/>
-                <w:i w:val="0"/>
-                <w:iCs w:val="0"/>
-                <w:color w:val="000000"/>
-                <w:kern w:val="0"/>
-                <w:sz w:val="22"/>
-                <w:szCs w:val="22"/>
-                <w:u w:val="none"/>
-                <w:lang w:val="en-US" w:eastAsia="zh-CN" w:bidi="ar"/>
-              </w:rPr>
-              <w:t>-0.143</w:t>
-            </w:r>
-          </w:p>
-        </w:tc>
-        <w:tc>
-          <w:tcPr>
-            <w:tcW w:w="332" w:type="pct"/>
+                <w:i w:val="0"/>
+                <w:iCs w:val="0"/>
+                <w:color w:val="000000"/>
+                <w:kern w:val="0"/>
+                <w:sz w:val="22"/>
+                <w:szCs w:val="22"/>
+                <w:u w:val="none"/>
+                <w:lang w:val="en-US" w:eastAsia="zh-CN" w:bidi="ar"/>
+              </w:rPr>
+              <w:t>-0.938</w:t>
+            </w:r>
+          </w:p>
+        </w:tc>
+        <w:tc>
+          <w:tcPr>
+            <w:tcW w:w="941" w:type="dxa"/>
             <w:tcBorders>
               <w:top w:val="nil"/>
               <w:left w:val="nil"/>
@@ -13345,39 +13171,23 @@
             </w:pPr>
             <w:r>
               <w:rPr>
-                <w:rFonts w:hint="default" w:ascii="宋体" w:hAnsi="宋体" w:eastAsia="宋体" w:cs="宋体"/>
-                <w:b w:val="0"/>
-                <w:i w:val="0"/>
-                <w:iCs w:val="0"/>
-                <w:color w:val="000000"/>
-                <w:kern w:val="0"/>
-                <w:sz w:val="22"/>
-                <w:szCs w:val="22"/>
-                <w:u w:val="none"/>
-                <w:lang w:val="en-US" w:eastAsia="zh-CN" w:bidi="ar"/>
-              </w:rPr>
-              <w:t xml:space="preserve">&lt; </w:t>
-            </w:r>
-            <w:r>
-              <w:rPr>
-                <w:rFonts w:hint="eastAsia" w:ascii="宋体" w:hAnsi="宋体" w:eastAsia="宋体" w:cs="宋体"/>
-                <w:b w:val="0"/>
-                <w:i w:val="0"/>
-                <w:iCs w:val="0"/>
-                <w:color w:val="000000"/>
-                <w:kern w:val="0"/>
-                <w:sz w:val="22"/>
-                <w:szCs w:val="22"/>
-                <w:u w:val="none"/>
-                <w:lang w:val="en-US" w:eastAsia="zh-CN" w:bidi="ar"/>
-              </w:rPr>
-              <w:t>.000</w:t>
-            </w:r>
-          </w:p>
-        </w:tc>
-        <w:tc>
-          <w:tcPr>
-            <w:tcW w:w="305" w:type="pct"/>
+                <w:rFonts w:hint="eastAsia" w:ascii="宋体" w:hAnsi="宋体" w:eastAsia="宋体" w:cs="宋体"/>
+                <w:i w:val="0"/>
+                <w:iCs w:val="0"/>
+                <w:color w:val="000000"/>
+                <w:kern w:val="0"/>
+                <w:sz w:val="22"/>
+                <w:szCs w:val="22"/>
+                <w:u w:val="none"/>
+                <w:lang w:val="en-US" w:eastAsia="zh-CN" w:bidi="ar"/>
+              </w:rPr>
+              <w:t>0.349</w:t>
+            </w:r>
+          </w:p>
+        </w:tc>
+        <w:tc>
+          <w:tcPr>
+            <w:tcW w:w="870" w:type="dxa"/>
             <w:tcBorders>
               <w:top w:val="nil"/>
               <w:left w:val="nil"/>
@@ -13410,7 +13220,6 @@
             <w:r>
               <w:rPr>
                 <w:rFonts w:hint="eastAsia" w:ascii="宋体" w:hAnsi="宋体" w:eastAsia="宋体" w:cs="宋体"/>
-                <w:b w:val="0"/>
                 <w:i w:val="0"/>
                 <w:iCs w:val="0"/>
                 <w:color w:val="000000"/>
@@ -13462,7 +13271,7 @@
         </w:tc>
         <w:tc>
           <w:tcPr>
-            <w:tcW w:w="356" w:type="pct"/>
+            <w:tcW w:w="1009" w:type="dxa"/>
             <w:tcBorders>
               <w:top w:val="nil"/>
               <w:left w:val="nil"/>
@@ -13495,23 +13304,22 @@
             <w:r>
               <w:rPr>
                 <w:rFonts w:hint="eastAsia" w:ascii="宋体" w:hAnsi="宋体" w:eastAsia="宋体" w:cs="宋体"/>
-                <w:b w:val="0"/>
-                <w:i w:val="0"/>
-                <w:iCs w:val="0"/>
-                <w:color w:val="000000"/>
-                <w:kern w:val="0"/>
-                <w:sz w:val="22"/>
-                <w:szCs w:val="22"/>
-                <w:u w:val="none"/>
-                <w:lang w:val="en-US" w:eastAsia="zh-CN" w:bidi="ar"/>
-              </w:rPr>
-              <w:t>-0.007</w:t>
-            </w:r>
-          </w:p>
-        </w:tc>
-        <w:tc>
-          <w:tcPr>
-            <w:tcW w:w="389" w:type="pct"/>
+                <w:i w:val="0"/>
+                <w:iCs w:val="0"/>
+                <w:color w:val="000000"/>
+                <w:kern w:val="0"/>
+                <w:sz w:val="22"/>
+                <w:szCs w:val="22"/>
+                <w:u w:val="none"/>
+                <w:lang w:val="en-US" w:eastAsia="zh-CN" w:bidi="ar"/>
+              </w:rPr>
+              <w:t>-0.068</w:t>
+            </w:r>
+          </w:p>
+        </w:tc>
+        <w:tc>
+          <w:tcPr>
+            <w:tcW w:w="1103" w:type="dxa"/>
             <w:tcBorders>
               <w:top w:val="nil"/>
               <w:left w:val="nil"/>
@@ -13544,23 +13352,22 @@
             <w:r>
               <w:rPr>
                 <w:rFonts w:hint="eastAsia" w:ascii="宋体" w:hAnsi="宋体" w:eastAsia="宋体" w:cs="宋体"/>
-                <w:b w:val="0"/>
-                <w:i w:val="0"/>
-                <w:iCs w:val="0"/>
-                <w:color w:val="000000"/>
-                <w:kern w:val="0"/>
-                <w:sz w:val="22"/>
-                <w:szCs w:val="22"/>
-                <w:u w:val="none"/>
-                <w:lang w:val="en-US" w:eastAsia="zh-CN" w:bidi="ar"/>
-              </w:rPr>
-              <w:t>-0.084</w:t>
-            </w:r>
-          </w:p>
-        </w:tc>
-        <w:tc>
-          <w:tcPr>
-            <w:tcW w:w="332" w:type="pct"/>
+                <w:i w:val="0"/>
+                <w:iCs w:val="0"/>
+                <w:color w:val="000000"/>
+                <w:kern w:val="0"/>
+                <w:sz w:val="22"/>
+                <w:szCs w:val="22"/>
+                <w:u w:val="none"/>
+                <w:lang w:val="en-US" w:eastAsia="zh-CN" w:bidi="ar"/>
+              </w:rPr>
+              <w:t>-0.887</w:t>
+            </w:r>
+          </w:p>
+        </w:tc>
+        <w:tc>
+          <w:tcPr>
+            <w:tcW w:w="942" w:type="dxa"/>
             <w:tcBorders>
               <w:top w:val="nil"/>
               <w:left w:val="nil"/>
@@ -13592,39 +13399,23 @@
             </w:pPr>
             <w:r>
               <w:rPr>
-                <w:rFonts w:hint="default" w:ascii="宋体" w:hAnsi="宋体" w:eastAsia="宋体" w:cs="宋体"/>
-                <w:b w:val="0"/>
-                <w:i w:val="0"/>
-                <w:iCs w:val="0"/>
-                <w:color w:val="000000"/>
-                <w:kern w:val="0"/>
-                <w:sz w:val="22"/>
-                <w:szCs w:val="22"/>
-                <w:u w:val="none"/>
-                <w:lang w:val="en-US" w:eastAsia="zh-CN" w:bidi="ar"/>
-              </w:rPr>
-              <w:t xml:space="preserve">&lt; </w:t>
-            </w:r>
-            <w:r>
-              <w:rPr>
-                <w:rFonts w:hint="eastAsia" w:ascii="宋体" w:hAnsi="宋体" w:eastAsia="宋体" w:cs="宋体"/>
-                <w:b w:val="0"/>
-                <w:i w:val="0"/>
-                <w:iCs w:val="0"/>
-                <w:color w:val="000000"/>
-                <w:kern w:val="0"/>
-                <w:sz w:val="22"/>
-                <w:szCs w:val="22"/>
-                <w:u w:val="none"/>
-                <w:lang w:val="en-US" w:eastAsia="zh-CN" w:bidi="ar"/>
-              </w:rPr>
-              <w:t>.000</w:t>
-            </w:r>
-          </w:p>
-        </w:tc>
-        <w:tc>
-          <w:tcPr>
-            <w:tcW w:w="305" w:type="pct"/>
+                <w:rFonts w:hint="eastAsia" w:ascii="宋体" w:hAnsi="宋体" w:eastAsia="宋体" w:cs="宋体"/>
+                <w:i w:val="0"/>
+                <w:iCs w:val="0"/>
+                <w:color w:val="000000"/>
+                <w:kern w:val="0"/>
+                <w:sz w:val="22"/>
+                <w:szCs w:val="22"/>
+                <w:u w:val="none"/>
+                <w:lang w:val="en-US" w:eastAsia="zh-CN" w:bidi="ar"/>
+              </w:rPr>
+              <w:t>0.376</w:t>
+            </w:r>
+          </w:p>
+        </w:tc>
+        <w:tc>
+          <w:tcPr>
+            <w:tcW w:w="871" w:type="dxa"/>
             <w:tcBorders>
               <w:top w:val="nil"/>
               <w:left w:val="nil"/>
@@ -13657,7 +13448,6 @@
             <w:r>
               <w:rPr>
                 <w:rFonts w:hint="eastAsia" w:ascii="宋体" w:hAnsi="宋体" w:eastAsia="宋体" w:cs="宋体"/>
-                <w:b w:val="0"/>
                 <w:i w:val="0"/>
                 <w:iCs w:val="0"/>
                 <w:color w:val="000000"/>
@@ -13727,7 +13517,7 @@
         </w:tc>
         <w:tc>
           <w:tcPr>
-            <w:tcW w:w="356" w:type="pct"/>
+            <w:tcW w:w="1009" w:type="dxa"/>
             <w:tcBorders>
               <w:top w:val="nil"/>
               <w:left w:val="nil"/>
@@ -13760,7 +13550,6 @@
             <w:r>
               <w:rPr>
                 <w:rFonts w:hint="eastAsia" w:ascii="宋体" w:hAnsi="宋体" w:eastAsia="宋体" w:cs="宋体"/>
-                <w:b w:val="0"/>
                 <w:i w:val="0"/>
                 <w:iCs w:val="0"/>
                 <w:color w:val="000000"/>
@@ -13776,7 +13565,7 @@
         </w:tc>
         <w:tc>
           <w:tcPr>
-            <w:tcW w:w="389" w:type="pct"/>
+            <w:tcW w:w="1103" w:type="dxa"/>
             <w:tcBorders>
               <w:top w:val="nil"/>
               <w:left w:val="nil"/>
@@ -13809,23 +13598,22 @@
             <w:r>
               <w:rPr>
                 <w:rFonts w:hint="eastAsia" w:ascii="宋体" w:hAnsi="宋体" w:eastAsia="宋体" w:cs="宋体"/>
-                <w:b w:val="0"/>
-                <w:i w:val="0"/>
-                <w:iCs w:val="0"/>
-                <w:color w:val="000000"/>
-                <w:kern w:val="0"/>
-                <w:sz w:val="22"/>
-                <w:szCs w:val="22"/>
-                <w:u w:val="none"/>
-                <w:lang w:val="en-US" w:eastAsia="zh-CN" w:bidi="ar"/>
-              </w:rPr>
-              <w:t>0.417</w:t>
-            </w:r>
-          </w:p>
-        </w:tc>
-        <w:tc>
-          <w:tcPr>
-            <w:tcW w:w="332" w:type="pct"/>
+                <w:i w:val="0"/>
+                <w:iCs w:val="0"/>
+                <w:color w:val="000000"/>
+                <w:kern w:val="0"/>
+                <w:sz w:val="22"/>
+                <w:szCs w:val="22"/>
+                <w:u w:val="none"/>
+                <w:lang w:val="en-US" w:eastAsia="zh-CN" w:bidi="ar"/>
+              </w:rPr>
+              <w:t>0.42</w:t>
+            </w:r>
+          </w:p>
+        </w:tc>
+        <w:tc>
+          <w:tcPr>
+            <w:tcW w:w="941" w:type="dxa"/>
             <w:tcBorders>
               <w:top w:val="nil"/>
               <w:left w:val="nil"/>
@@ -13857,39 +13645,23 @@
             </w:pPr>
             <w:r>
               <w:rPr>
-                <w:rFonts w:hint="default" w:ascii="宋体" w:hAnsi="宋体" w:eastAsia="宋体" w:cs="宋体"/>
-                <w:b w:val="0"/>
-                <w:i w:val="0"/>
-                <w:iCs w:val="0"/>
-                <w:color w:val="000000"/>
-                <w:kern w:val="0"/>
-                <w:sz w:val="22"/>
-                <w:szCs w:val="22"/>
-                <w:u w:val="none"/>
-                <w:lang w:val="en-US" w:eastAsia="zh-CN" w:bidi="ar"/>
-              </w:rPr>
-              <w:t xml:space="preserve">&lt; </w:t>
-            </w:r>
-            <w:r>
-              <w:rPr>
-                <w:rFonts w:hint="eastAsia" w:ascii="宋体" w:hAnsi="宋体" w:eastAsia="宋体" w:cs="宋体"/>
-                <w:b w:val="0"/>
-                <w:i w:val="0"/>
-                <w:iCs w:val="0"/>
-                <w:color w:val="000000"/>
-                <w:kern w:val="0"/>
-                <w:sz w:val="22"/>
-                <w:szCs w:val="22"/>
-                <w:u w:val="none"/>
-                <w:lang w:val="en-US" w:eastAsia="zh-CN" w:bidi="ar"/>
-              </w:rPr>
-              <w:t>.000</w:t>
-            </w:r>
-          </w:p>
-        </w:tc>
-        <w:tc>
-          <w:tcPr>
-            <w:tcW w:w="305" w:type="pct"/>
+                <w:rFonts w:hint="eastAsia" w:ascii="宋体" w:hAnsi="宋体" w:eastAsia="宋体" w:cs="宋体"/>
+                <w:i w:val="0"/>
+                <w:iCs w:val="0"/>
+                <w:color w:val="000000"/>
+                <w:kern w:val="0"/>
+                <w:sz w:val="22"/>
+                <w:szCs w:val="22"/>
+                <w:u w:val="none"/>
+                <w:lang w:val="en-US" w:eastAsia="zh-CN" w:bidi="ar"/>
+              </w:rPr>
+              <w:t>0.674</w:t>
+            </w:r>
+          </w:p>
+        </w:tc>
+        <w:tc>
+          <w:tcPr>
+            <w:tcW w:w="870" w:type="dxa"/>
             <w:tcBorders>
               <w:top w:val="nil"/>
               <w:left w:val="nil"/>
@@ -13922,7 +13694,6 @@
             <w:r>
               <w:rPr>
                 <w:rFonts w:hint="eastAsia" w:ascii="宋体" w:hAnsi="宋体" w:eastAsia="宋体" w:cs="宋体"/>
-                <w:b w:val="0"/>
                 <w:i w:val="0"/>
                 <w:iCs w:val="0"/>
                 <w:color w:val="000000"/>
@@ -13974,7 +13745,7 @@
         </w:tc>
         <w:tc>
           <w:tcPr>
-            <w:tcW w:w="356" w:type="pct"/>
+            <w:tcW w:w="1009" w:type="dxa"/>
             <w:tcBorders>
               <w:top w:val="nil"/>
               <w:left w:val="nil"/>
@@ -14007,23 +13778,22 @@
             <w:r>
               <w:rPr>
                 <w:rFonts w:hint="eastAsia" w:ascii="宋体" w:hAnsi="宋体" w:eastAsia="宋体" w:cs="宋体"/>
-                <w:b w:val="0"/>
-                <w:i w:val="0"/>
-                <w:iCs w:val="0"/>
-                <w:color w:val="000000"/>
-                <w:kern w:val="0"/>
-                <w:sz w:val="22"/>
-                <w:szCs w:val="22"/>
-                <w:u w:val="none"/>
-                <w:lang w:val="en-US" w:eastAsia="zh-CN" w:bidi="ar"/>
-              </w:rPr>
-              <w:t>0.019</w:t>
-            </w:r>
-          </w:p>
-        </w:tc>
-        <w:tc>
-          <w:tcPr>
-            <w:tcW w:w="389" w:type="pct"/>
+                <w:i w:val="0"/>
+                <w:iCs w:val="0"/>
+                <w:color w:val="000000"/>
+                <w:kern w:val="0"/>
+                <w:sz w:val="22"/>
+                <w:szCs w:val="22"/>
+                <w:u w:val="none"/>
+                <w:lang w:val="en-US" w:eastAsia="zh-CN" w:bidi="ar"/>
+              </w:rPr>
+              <w:t>0.017</w:t>
+            </w:r>
+          </w:p>
+        </w:tc>
+        <w:tc>
+          <w:tcPr>
+            <w:tcW w:w="1103" w:type="dxa"/>
             <w:tcBorders>
               <w:top w:val="nil"/>
               <w:left w:val="nil"/>
@@ -14056,23 +13826,22 @@
             <w:r>
               <w:rPr>
                 <w:rFonts w:hint="eastAsia" w:ascii="宋体" w:hAnsi="宋体" w:eastAsia="宋体" w:cs="宋体"/>
-                <w:b w:val="0"/>
-                <w:i w:val="0"/>
-                <w:iCs w:val="0"/>
-                <w:color w:val="000000"/>
-                <w:kern w:val="0"/>
-                <w:sz w:val="22"/>
-                <w:szCs w:val="22"/>
-                <w:u w:val="none"/>
-                <w:lang w:val="en-US" w:eastAsia="zh-CN" w:bidi="ar"/>
-              </w:rPr>
-              <w:t>0.321</w:t>
-            </w:r>
-          </w:p>
-        </w:tc>
-        <w:tc>
-          <w:tcPr>
-            <w:tcW w:w="332" w:type="pct"/>
+                <w:i w:val="0"/>
+                <w:iCs w:val="0"/>
+                <w:color w:val="000000"/>
+                <w:kern w:val="0"/>
+                <w:sz w:val="22"/>
+                <w:szCs w:val="22"/>
+                <w:u w:val="none"/>
+                <w:lang w:val="en-US" w:eastAsia="zh-CN" w:bidi="ar"/>
+              </w:rPr>
+              <w:t>0.296</w:t>
+            </w:r>
+          </w:p>
+        </w:tc>
+        <w:tc>
+          <w:tcPr>
+            <w:tcW w:w="941" w:type="dxa"/>
             <w:tcBorders>
               <w:top w:val="nil"/>
               <w:left w:val="nil"/>
@@ -14104,39 +13873,23 @@
             </w:pPr>
             <w:r>
               <w:rPr>
-                <w:rFonts w:hint="default" w:ascii="宋体" w:hAnsi="宋体" w:eastAsia="宋体" w:cs="宋体"/>
-                <w:b w:val="0"/>
-                <w:i w:val="0"/>
-                <w:iCs w:val="0"/>
-                <w:color w:val="000000"/>
-                <w:kern w:val="0"/>
-                <w:sz w:val="22"/>
-                <w:szCs w:val="22"/>
-                <w:u w:val="none"/>
-                <w:lang w:val="en-US" w:eastAsia="zh-CN" w:bidi="ar"/>
-              </w:rPr>
-              <w:t xml:space="preserve">&lt; </w:t>
-            </w:r>
-            <w:r>
-              <w:rPr>
-                <w:rFonts w:hint="eastAsia" w:ascii="宋体" w:hAnsi="宋体" w:eastAsia="宋体" w:cs="宋体"/>
-                <w:b w:val="0"/>
-                <w:i w:val="0"/>
-                <w:iCs w:val="0"/>
-                <w:color w:val="000000"/>
-                <w:kern w:val="0"/>
-                <w:sz w:val="22"/>
-                <w:szCs w:val="22"/>
-                <w:u w:val="none"/>
-                <w:lang w:val="en-US" w:eastAsia="zh-CN" w:bidi="ar"/>
-              </w:rPr>
-              <w:t>.000</w:t>
-            </w:r>
-          </w:p>
-        </w:tc>
-        <w:tc>
-          <w:tcPr>
-            <w:tcW w:w="305" w:type="pct"/>
+                <w:rFonts w:hint="eastAsia" w:ascii="宋体" w:hAnsi="宋体" w:eastAsia="宋体" w:cs="宋体"/>
+                <w:i w:val="0"/>
+                <w:iCs w:val="0"/>
+                <w:color w:val="000000"/>
+                <w:kern w:val="0"/>
+                <w:sz w:val="22"/>
+                <w:szCs w:val="22"/>
+                <w:u w:val="none"/>
+                <w:lang w:val="en-US" w:eastAsia="zh-CN" w:bidi="ar"/>
+              </w:rPr>
+              <w:t>0.768</w:t>
+            </w:r>
+          </w:p>
+        </w:tc>
+        <w:tc>
+          <w:tcPr>
+            <w:tcW w:w="870" w:type="dxa"/>
             <w:tcBorders>
               <w:top w:val="nil"/>
               <w:left w:val="nil"/>
@@ -14169,7 +13922,6 @@
             <w:r>
               <w:rPr>
                 <w:rFonts w:hint="eastAsia" w:ascii="宋体" w:hAnsi="宋体" w:eastAsia="宋体" w:cs="宋体"/>
-                <w:b w:val="0"/>
                 <w:i w:val="0"/>
                 <w:iCs w:val="0"/>
                 <w:color w:val="000000"/>
@@ -14221,7 +13973,7 @@
         </w:tc>
         <w:tc>
           <w:tcPr>
-            <w:tcW w:w="356" w:type="pct"/>
+            <w:tcW w:w="1009" w:type="dxa"/>
             <w:tcBorders>
               <w:top w:val="nil"/>
               <w:left w:val="nil"/>
@@ -14254,23 +14006,22 @@
             <w:r>
               <w:rPr>
                 <w:rFonts w:hint="eastAsia" w:ascii="宋体" w:hAnsi="宋体" w:eastAsia="宋体" w:cs="宋体"/>
-                <w:b w:val="0"/>
-                <w:i w:val="0"/>
-                <w:iCs w:val="0"/>
-                <w:color w:val="000000"/>
-                <w:kern w:val="0"/>
-                <w:sz w:val="22"/>
-                <w:szCs w:val="22"/>
-                <w:u w:val="none"/>
-                <w:lang w:val="en-US" w:eastAsia="zh-CN" w:bidi="ar"/>
-              </w:rPr>
-              <w:t>0.013</w:t>
-            </w:r>
-          </w:p>
-        </w:tc>
-        <w:tc>
-          <w:tcPr>
-            <w:tcW w:w="389" w:type="pct"/>
+                <w:i w:val="0"/>
+                <w:iCs w:val="0"/>
+                <w:color w:val="000000"/>
+                <w:kern w:val="0"/>
+                <w:sz w:val="22"/>
+                <w:szCs w:val="22"/>
+                <w:u w:val="none"/>
+                <w:lang w:val="en-US" w:eastAsia="zh-CN" w:bidi="ar"/>
+              </w:rPr>
+              <w:t>0.012</w:t>
+            </w:r>
+          </w:p>
+        </w:tc>
+        <w:tc>
+          <w:tcPr>
+            <w:tcW w:w="1103" w:type="dxa"/>
             <w:tcBorders>
               <w:top w:val="nil"/>
               <w:left w:val="nil"/>
@@ -14303,23 +14054,22 @@
             <w:r>
               <w:rPr>
                 <w:rFonts w:hint="eastAsia" w:ascii="宋体" w:hAnsi="宋体" w:eastAsia="宋体" w:cs="宋体"/>
-                <w:b w:val="0"/>
-                <w:i w:val="0"/>
-                <w:iCs w:val="0"/>
-                <w:color w:val="000000"/>
-                <w:kern w:val="0"/>
-                <w:sz w:val="22"/>
-                <w:szCs w:val="22"/>
-                <w:u w:val="none"/>
-                <w:lang w:val="en-US" w:eastAsia="zh-CN" w:bidi="ar"/>
-              </w:rPr>
-              <w:t>0.214</w:t>
-            </w:r>
-          </w:p>
-        </w:tc>
-        <w:tc>
-          <w:tcPr>
-            <w:tcW w:w="332" w:type="pct"/>
+                <w:i w:val="0"/>
+                <w:iCs w:val="0"/>
+                <w:color w:val="000000"/>
+                <w:kern w:val="0"/>
+                <w:sz w:val="22"/>
+                <w:szCs w:val="22"/>
+                <w:u w:val="none"/>
+                <w:lang w:val="en-US" w:eastAsia="zh-CN" w:bidi="ar"/>
+              </w:rPr>
+              <w:t>0.197</w:t>
+            </w:r>
+          </w:p>
+        </w:tc>
+        <w:tc>
+          <w:tcPr>
+            <w:tcW w:w="942" w:type="dxa"/>
             <w:tcBorders>
               <w:top w:val="nil"/>
               <w:left w:val="nil"/>
@@ -14351,39 +14101,23 @@
             </w:pPr>
             <w:r>
               <w:rPr>
-                <w:rFonts w:hint="default" w:ascii="宋体" w:hAnsi="宋体" w:eastAsia="宋体" w:cs="宋体"/>
-                <w:b w:val="0"/>
-                <w:i w:val="0"/>
-                <w:iCs w:val="0"/>
-                <w:color w:val="000000"/>
-                <w:kern w:val="0"/>
-                <w:sz w:val="22"/>
-                <w:szCs w:val="22"/>
-                <w:u w:val="none"/>
-                <w:lang w:val="en-US" w:eastAsia="zh-CN" w:bidi="ar"/>
-              </w:rPr>
-              <w:t xml:space="preserve">&lt; </w:t>
-            </w:r>
-            <w:r>
-              <w:rPr>
-                <w:rFonts w:hint="eastAsia" w:ascii="宋体" w:hAnsi="宋体" w:eastAsia="宋体" w:cs="宋体"/>
-                <w:b w:val="0"/>
-                <w:i w:val="0"/>
-                <w:iCs w:val="0"/>
-                <w:color w:val="000000"/>
-                <w:kern w:val="0"/>
-                <w:sz w:val="22"/>
-                <w:szCs w:val="22"/>
-                <w:u w:val="none"/>
-                <w:lang w:val="en-US" w:eastAsia="zh-CN" w:bidi="ar"/>
-              </w:rPr>
-              <w:t>.000</w:t>
-            </w:r>
-          </w:p>
-        </w:tc>
-        <w:tc>
-          <w:tcPr>
-            <w:tcW w:w="305" w:type="pct"/>
+                <w:rFonts w:hint="eastAsia" w:ascii="宋体" w:hAnsi="宋体" w:eastAsia="宋体" w:cs="宋体"/>
+                <w:i w:val="0"/>
+                <w:iCs w:val="0"/>
+                <w:color w:val="000000"/>
+                <w:kern w:val="0"/>
+                <w:sz w:val="22"/>
+                <w:szCs w:val="22"/>
+                <w:u w:val="none"/>
+                <w:lang w:val="en-US" w:eastAsia="zh-CN" w:bidi="ar"/>
+              </w:rPr>
+              <w:t>0.844</w:t>
+            </w:r>
+          </w:p>
+        </w:tc>
+        <w:tc>
+          <w:tcPr>
+            <w:tcW w:w="871" w:type="dxa"/>
             <w:tcBorders>
               <w:top w:val="nil"/>
               <w:left w:val="nil"/>
@@ -14416,7 +14150,6 @@
             <w:r>
               <w:rPr>
                 <w:rFonts w:hint="eastAsia" w:ascii="宋体" w:hAnsi="宋体" w:eastAsia="宋体" w:cs="宋体"/>
-                <w:b w:val="0"/>
                 <w:i w:val="0"/>
                 <w:iCs w:val="0"/>
                 <w:color w:val="000000"/>
@@ -14486,7 +14219,7 @@
         </w:tc>
         <w:tc>
           <w:tcPr>
-            <w:tcW w:w="356" w:type="pct"/>
+            <w:tcW w:w="1009" w:type="dxa"/>
             <w:tcBorders>
               <w:top w:val="nil"/>
               <w:left w:val="nil"/>
@@ -14519,23 +14252,22 @@
             <w:r>
               <w:rPr>
                 <w:rFonts w:hint="eastAsia" w:ascii="宋体" w:hAnsi="宋体" w:eastAsia="宋体" w:cs="宋体"/>
-                <w:b w:val="0"/>
-                <w:i w:val="0"/>
-                <w:iCs w:val="0"/>
-                <w:color w:val="000000"/>
-                <w:kern w:val="0"/>
-                <w:sz w:val="22"/>
-                <w:szCs w:val="22"/>
-                <w:u w:val="none"/>
-                <w:lang w:val="en-US" w:eastAsia="zh-CN" w:bidi="ar"/>
-              </w:rPr>
-              <w:t>0.085</w:t>
-            </w:r>
-          </w:p>
-        </w:tc>
-        <w:tc>
-          <w:tcPr>
-            <w:tcW w:w="389" w:type="pct"/>
+                <w:i w:val="0"/>
+                <w:iCs w:val="0"/>
+                <w:color w:val="000000"/>
+                <w:kern w:val="0"/>
+                <w:sz w:val="22"/>
+                <w:szCs w:val="22"/>
+                <w:u w:val="none"/>
+                <w:lang w:val="en-US" w:eastAsia="zh-CN" w:bidi="ar"/>
+              </w:rPr>
+              <w:t>0.007</w:t>
+            </w:r>
+          </w:p>
+        </w:tc>
+        <w:tc>
+          <w:tcPr>
+            <w:tcW w:w="1103" w:type="dxa"/>
             <w:tcBorders>
               <w:top w:val="nil"/>
               <w:left w:val="nil"/>
@@ -14568,23 +14300,22 @@
             <w:r>
               <w:rPr>
                 <w:rFonts w:hint="eastAsia" w:ascii="宋体" w:hAnsi="宋体" w:eastAsia="宋体" w:cs="宋体"/>
-                <w:b w:val="0"/>
-                <w:i w:val="0"/>
-                <w:iCs w:val="0"/>
-                <w:color w:val="000000"/>
-                <w:kern w:val="0"/>
-                <w:sz w:val="22"/>
-                <w:szCs w:val="22"/>
-                <w:u w:val="none"/>
-                <w:lang w:val="en-US" w:eastAsia="zh-CN" w:bidi="ar"/>
-              </w:rPr>
-              <w:t>1.492</w:t>
-            </w:r>
-          </w:p>
-        </w:tc>
-        <w:tc>
-          <w:tcPr>
-            <w:tcW w:w="332" w:type="pct"/>
+                <w:i w:val="0"/>
+                <w:iCs w:val="0"/>
+                <w:color w:val="000000"/>
+                <w:kern w:val="0"/>
+                <w:sz w:val="22"/>
+                <w:szCs w:val="22"/>
+                <w:u w:val="none"/>
+                <w:lang w:val="en-US" w:eastAsia="zh-CN" w:bidi="ar"/>
+              </w:rPr>
+              <w:t>0.127</w:t>
+            </w:r>
+          </w:p>
+        </w:tc>
+        <w:tc>
+          <w:tcPr>
+            <w:tcW w:w="941" w:type="dxa"/>
             <w:tcBorders>
               <w:top w:val="nil"/>
               <w:left w:val="nil"/>
@@ -14617,23 +14348,22 @@
             <w:r>
               <w:rPr>
                 <w:rFonts w:hint="eastAsia" w:ascii="宋体" w:hAnsi="宋体" w:eastAsia="宋体" w:cs="宋体"/>
-                <w:b w:val="0"/>
-                <w:i w:val="0"/>
-                <w:iCs w:val="0"/>
-                <w:color w:val="000000"/>
-                <w:kern w:val="0"/>
-                <w:sz w:val="22"/>
-                <w:szCs w:val="22"/>
-                <w:u w:val="none"/>
-                <w:lang w:val="en-US" w:eastAsia="zh-CN" w:bidi="ar"/>
-              </w:rPr>
-              <w:t>.006</w:t>
-            </w:r>
-          </w:p>
-        </w:tc>
-        <w:tc>
-          <w:tcPr>
-            <w:tcW w:w="305" w:type="pct"/>
+                <w:i w:val="0"/>
+                <w:iCs w:val="0"/>
+                <w:color w:val="000000"/>
+                <w:kern w:val="0"/>
+                <w:sz w:val="22"/>
+                <w:szCs w:val="22"/>
+                <w:u w:val="none"/>
+                <w:lang w:val="en-US" w:eastAsia="zh-CN" w:bidi="ar"/>
+              </w:rPr>
+              <w:t>0.899</w:t>
+            </w:r>
+          </w:p>
+        </w:tc>
+        <w:tc>
+          <w:tcPr>
+            <w:tcW w:w="870" w:type="dxa"/>
             <w:tcBorders>
               <w:top w:val="nil"/>
               <w:left w:val="nil"/>
@@ -14666,7 +14396,6 @@
             <w:r>
               <w:rPr>
                 <w:rFonts w:hint="eastAsia" w:ascii="宋体" w:hAnsi="宋体" w:eastAsia="宋体" w:cs="宋体"/>
-                <w:b w:val="0"/>
                 <w:i w:val="0"/>
                 <w:iCs w:val="0"/>
                 <w:color w:val="000000"/>
@@ -14718,7 +14447,7 @@
         </w:tc>
         <w:tc>
           <w:tcPr>
-            <w:tcW w:w="356" w:type="pct"/>
+            <w:tcW w:w="1009" w:type="dxa"/>
             <w:tcBorders>
               <w:top w:val="nil"/>
               <w:left w:val="nil"/>
@@ -14751,23 +14480,22 @@
             <w:r>
               <w:rPr>
                 <w:rFonts w:hint="eastAsia" w:ascii="宋体" w:hAnsi="宋体" w:eastAsia="宋体" w:cs="宋体"/>
-                <w:b w:val="0"/>
-                <w:i w:val="0"/>
-                <w:iCs w:val="0"/>
-                <w:color w:val="000000"/>
-                <w:kern w:val="0"/>
-                <w:sz w:val="22"/>
-                <w:szCs w:val="22"/>
-                <w:u w:val="none"/>
-                <w:lang w:val="en-US" w:eastAsia="zh-CN" w:bidi="ar"/>
-              </w:rPr>
-              <w:t>0.073</w:t>
-            </w:r>
-          </w:p>
-        </w:tc>
-        <w:tc>
-          <w:tcPr>
-            <w:tcW w:w="389" w:type="pct"/>
+                <w:i w:val="0"/>
+                <w:iCs w:val="0"/>
+                <w:color w:val="000000"/>
+                <w:kern w:val="0"/>
+                <w:sz w:val="22"/>
+                <w:szCs w:val="22"/>
+                <w:u w:val="none"/>
+                <w:lang w:val="en-US" w:eastAsia="zh-CN" w:bidi="ar"/>
+              </w:rPr>
+              <w:t>-0.007</w:t>
+            </w:r>
+          </w:p>
+        </w:tc>
+        <w:tc>
+          <w:tcPr>
+            <w:tcW w:w="1103" w:type="dxa"/>
             <w:tcBorders>
               <w:top w:val="nil"/>
               <w:left w:val="nil"/>
@@ -14800,23 +14528,22 @@
             <w:r>
               <w:rPr>
                 <w:rFonts w:hint="eastAsia" w:ascii="宋体" w:hAnsi="宋体" w:eastAsia="宋体" w:cs="宋体"/>
-                <w:b w:val="0"/>
-                <w:i w:val="0"/>
-                <w:iCs w:val="0"/>
-                <w:color w:val="000000"/>
-                <w:kern w:val="0"/>
-                <w:sz w:val="22"/>
-                <w:szCs w:val="22"/>
-                <w:u w:val="none"/>
-                <w:lang w:val="en-US" w:eastAsia="zh-CN" w:bidi="ar"/>
-              </w:rPr>
-              <w:t>1.334</w:t>
-            </w:r>
-          </w:p>
-        </w:tc>
-        <w:tc>
-          <w:tcPr>
-            <w:tcW w:w="332" w:type="pct"/>
+                <w:i w:val="0"/>
+                <w:iCs w:val="0"/>
+                <w:color w:val="000000"/>
+                <w:kern w:val="0"/>
+                <w:sz w:val="22"/>
+                <w:szCs w:val="22"/>
+                <w:u w:val="none"/>
+                <w:lang w:val="en-US" w:eastAsia="zh-CN" w:bidi="ar"/>
+              </w:rPr>
+              <w:t>-0.132</w:t>
+            </w:r>
+          </w:p>
+        </w:tc>
+        <w:tc>
+          <w:tcPr>
+            <w:tcW w:w="941" w:type="dxa"/>
             <w:tcBorders>
               <w:top w:val="nil"/>
               <w:left w:val="nil"/>
@@ -14849,23 +14576,22 @@
             <w:r>
               <w:rPr>
                 <w:rFonts w:hint="eastAsia" w:ascii="宋体" w:hAnsi="宋体" w:eastAsia="宋体" w:cs="宋体"/>
-                <w:b w:val="0"/>
-                <w:i w:val="0"/>
-                <w:iCs w:val="0"/>
-                <w:color w:val="000000"/>
-                <w:kern w:val="0"/>
-                <w:sz w:val="22"/>
-                <w:szCs w:val="22"/>
-                <w:u w:val="none"/>
-                <w:lang w:val="en-US" w:eastAsia="zh-CN" w:bidi="ar"/>
-              </w:rPr>
-              <w:t>.005</w:t>
-            </w:r>
-          </w:p>
-        </w:tc>
-        <w:tc>
-          <w:tcPr>
-            <w:tcW w:w="305" w:type="pct"/>
+                <w:i w:val="0"/>
+                <w:iCs w:val="0"/>
+                <w:color w:val="000000"/>
+                <w:kern w:val="0"/>
+                <w:sz w:val="22"/>
+                <w:szCs w:val="22"/>
+                <w:u w:val="none"/>
+                <w:lang w:val="en-US" w:eastAsia="zh-CN" w:bidi="ar"/>
+              </w:rPr>
+              <w:t>0.895</w:t>
+            </w:r>
+          </w:p>
+        </w:tc>
+        <w:tc>
+          <w:tcPr>
+            <w:tcW w:w="870" w:type="dxa"/>
             <w:tcBorders>
               <w:top w:val="nil"/>
               <w:left w:val="nil"/>
@@ -14898,7 +14624,6 @@
             <w:r>
               <w:rPr>
                 <w:rFonts w:hint="eastAsia" w:ascii="宋体" w:hAnsi="宋体" w:eastAsia="宋体" w:cs="宋体"/>
-                <w:b w:val="0"/>
                 <w:i w:val="0"/>
                 <w:iCs w:val="0"/>
                 <w:color w:val="000000"/>
@@ -14950,7 +14675,7 @@
         </w:tc>
         <w:tc>
           <w:tcPr>
-            <w:tcW w:w="356" w:type="pct"/>
+            <w:tcW w:w="1009" w:type="dxa"/>
             <w:tcBorders>
               <w:top w:val="nil"/>
               <w:left w:val="nil"/>
@@ -14983,23 +14708,22 @@
             <w:r>
               <w:rPr>
                 <w:rFonts w:hint="eastAsia" w:ascii="宋体" w:hAnsi="宋体" w:eastAsia="宋体" w:cs="宋体"/>
-                <w:b w:val="0"/>
-                <w:i w:val="0"/>
-                <w:iCs w:val="0"/>
-                <w:color w:val="000000"/>
-                <w:kern w:val="0"/>
-                <w:sz w:val="22"/>
-                <w:szCs w:val="22"/>
-                <w:u w:val="none"/>
-                <w:lang w:val="en-US" w:eastAsia="zh-CN" w:bidi="ar"/>
-              </w:rPr>
-              <w:t>0.081</w:t>
-            </w:r>
-          </w:p>
-        </w:tc>
-        <w:tc>
-          <w:tcPr>
-            <w:tcW w:w="389" w:type="pct"/>
+                <w:i w:val="0"/>
+                <w:iCs w:val="0"/>
+                <w:color w:val="000000"/>
+                <w:kern w:val="0"/>
+                <w:sz w:val="22"/>
+                <w:szCs w:val="22"/>
+                <w:u w:val="none"/>
+                <w:lang w:val="en-US" w:eastAsia="zh-CN" w:bidi="ar"/>
+              </w:rPr>
+              <w:t>0</w:t>
+            </w:r>
+          </w:p>
+        </w:tc>
+        <w:tc>
+          <w:tcPr>
+            <w:tcW w:w="1103" w:type="dxa"/>
             <w:tcBorders>
               <w:top w:val="nil"/>
               <w:left w:val="nil"/>
@@ -15032,23 +14756,22 @@
             <w:r>
               <w:rPr>
                 <w:rFonts w:hint="eastAsia" w:ascii="宋体" w:hAnsi="宋体" w:eastAsia="宋体" w:cs="宋体"/>
-                <w:b w:val="0"/>
-                <w:i w:val="0"/>
-                <w:iCs w:val="0"/>
-                <w:color w:val="000000"/>
-                <w:kern w:val="0"/>
-                <w:sz w:val="22"/>
-                <w:szCs w:val="22"/>
-                <w:u w:val="none"/>
-                <w:lang w:val="en-US" w:eastAsia="zh-CN" w:bidi="ar"/>
-              </w:rPr>
-              <w:t>1.476</w:t>
-            </w:r>
-          </w:p>
-        </w:tc>
-        <w:tc>
-          <w:tcPr>
-            <w:tcW w:w="332" w:type="pct"/>
+                <w:i w:val="0"/>
+                <w:iCs w:val="0"/>
+                <w:color w:val="000000"/>
+                <w:kern w:val="0"/>
+                <w:sz w:val="22"/>
+                <w:szCs w:val="22"/>
+                <w:u w:val="none"/>
+                <w:lang w:val="en-US" w:eastAsia="zh-CN" w:bidi="ar"/>
+              </w:rPr>
+              <w:t>-0.007</w:t>
+            </w:r>
+          </w:p>
+        </w:tc>
+        <w:tc>
+          <w:tcPr>
+            <w:tcW w:w="942" w:type="dxa"/>
             <w:tcBorders>
               <w:top w:val="nil"/>
               <w:left w:val="nil"/>
@@ -15081,23 +14804,22 @@
             <w:r>
               <w:rPr>
                 <w:rFonts w:hint="eastAsia" w:ascii="宋体" w:hAnsi="宋体" w:eastAsia="宋体" w:cs="宋体"/>
-                <w:b w:val="0"/>
-                <w:i w:val="0"/>
-                <w:iCs w:val="0"/>
-                <w:color w:val="000000"/>
-                <w:kern w:val="0"/>
-                <w:sz w:val="22"/>
-                <w:szCs w:val="22"/>
-                <w:u w:val="none"/>
-                <w:lang w:val="en-US" w:eastAsia="zh-CN" w:bidi="ar"/>
-              </w:rPr>
-              <w:t>.006</w:t>
-            </w:r>
-          </w:p>
-        </w:tc>
-        <w:tc>
-          <w:tcPr>
-            <w:tcW w:w="305" w:type="pct"/>
+                <w:i w:val="0"/>
+                <w:iCs w:val="0"/>
+                <w:color w:val="000000"/>
+                <w:kern w:val="0"/>
+                <w:sz w:val="22"/>
+                <w:szCs w:val="22"/>
+                <w:u w:val="none"/>
+                <w:lang w:val="en-US" w:eastAsia="zh-CN" w:bidi="ar"/>
+              </w:rPr>
+              <w:t>0.994</w:t>
+            </w:r>
+          </w:p>
+        </w:tc>
+        <w:tc>
+          <w:tcPr>
+            <w:tcW w:w="871" w:type="dxa"/>
             <w:tcBorders>
               <w:top w:val="nil"/>
               <w:left w:val="nil"/>
@@ -15130,7 +14852,6 @@
             <w:r>
               <w:rPr>
                 <w:rFonts w:hint="eastAsia" w:ascii="宋体" w:hAnsi="宋体" w:eastAsia="宋体" w:cs="宋体"/>
-                <w:b w:val="0"/>
                 <w:i w:val="0"/>
                 <w:iCs w:val="0"/>
                 <w:color w:val="000000"/>
@@ -15200,7 +14921,7 @@
         </w:tc>
         <w:tc>
           <w:tcPr>
-            <w:tcW w:w="356" w:type="pct"/>
+            <w:tcW w:w="1009" w:type="dxa"/>
             <w:tcBorders>
               <w:top w:val="nil"/>
               <w:left w:val="nil"/>
@@ -15233,23 +14954,22 @@
             <w:r>
               <w:rPr>
                 <w:rFonts w:hint="eastAsia" w:ascii="宋体" w:hAnsi="宋体" w:eastAsia="宋体" w:cs="宋体"/>
-                <w:b w:val="0"/>
-                <w:i w:val="0"/>
-                <w:iCs w:val="0"/>
-                <w:color w:val="000000"/>
-                <w:kern w:val="0"/>
-                <w:sz w:val="22"/>
-                <w:szCs w:val="22"/>
-                <w:u w:val="none"/>
-                <w:lang w:val="en-US" w:eastAsia="zh-CN" w:bidi="ar"/>
-              </w:rPr>
-              <w:t>-0.034</w:t>
-            </w:r>
-          </w:p>
-        </w:tc>
-        <w:tc>
-          <w:tcPr>
-            <w:tcW w:w="389" w:type="pct"/>
+                <w:i w:val="0"/>
+                <w:iCs w:val="0"/>
+                <w:color w:val="000000"/>
+                <w:kern w:val="0"/>
+                <w:sz w:val="22"/>
+                <w:szCs w:val="22"/>
+                <w:u w:val="none"/>
+                <w:lang w:val="en-US" w:eastAsia="zh-CN" w:bidi="ar"/>
+              </w:rPr>
+              <w:t>-0.05</w:t>
+            </w:r>
+          </w:p>
+        </w:tc>
+        <w:tc>
+          <w:tcPr>
+            <w:tcW w:w="1103" w:type="dxa"/>
             <w:tcBorders>
               <w:top w:val="nil"/>
               <w:left w:val="nil"/>
@@ -15282,23 +15002,22 @@
             <w:r>
               <w:rPr>
                 <w:rFonts w:hint="eastAsia" w:ascii="宋体" w:hAnsi="宋体" w:eastAsia="宋体" w:cs="宋体"/>
-                <w:b w:val="0"/>
-                <w:i w:val="0"/>
-                <w:iCs w:val="0"/>
-                <w:color w:val="000000"/>
-                <w:kern w:val="0"/>
-                <w:sz w:val="22"/>
-                <w:szCs w:val="22"/>
-                <w:u w:val="none"/>
-                <w:lang w:val="en-US" w:eastAsia="zh-CN" w:bidi="ar"/>
-              </w:rPr>
-              <w:t>-0.440</w:t>
-            </w:r>
-          </w:p>
-        </w:tc>
-        <w:tc>
-          <w:tcPr>
-            <w:tcW w:w="332" w:type="pct"/>
+                <w:i w:val="0"/>
+                <w:iCs w:val="0"/>
+                <w:color w:val="000000"/>
+                <w:kern w:val="0"/>
+                <w:sz w:val="22"/>
+                <w:szCs w:val="22"/>
+                <w:u w:val="none"/>
+                <w:lang w:val="en-US" w:eastAsia="zh-CN" w:bidi="ar"/>
+              </w:rPr>
+              <w:t>-0.647</w:t>
+            </w:r>
+          </w:p>
+        </w:tc>
+        <w:tc>
+          <w:tcPr>
+            <w:tcW w:w="941" w:type="dxa"/>
             <w:tcBorders>
               <w:top w:val="nil"/>
               <w:left w:val="nil"/>
@@ -15331,23 +15050,22 @@
             <w:r>
               <w:rPr>
                 <w:rFonts w:hint="eastAsia" w:ascii="宋体" w:hAnsi="宋体" w:eastAsia="宋体" w:cs="宋体"/>
-                <w:b w:val="0"/>
-                <w:i w:val="0"/>
-                <w:iCs w:val="0"/>
-                <w:color w:val="000000"/>
-                <w:kern w:val="0"/>
-                <w:sz w:val="22"/>
-                <w:szCs w:val="22"/>
-                <w:u w:val="none"/>
-                <w:lang w:val="en-US" w:eastAsia="zh-CN" w:bidi="ar"/>
-              </w:rPr>
-              <w:t>.001</w:t>
-            </w:r>
-          </w:p>
-        </w:tc>
-        <w:tc>
-          <w:tcPr>
-            <w:tcW w:w="305" w:type="pct"/>
+                <w:i w:val="0"/>
+                <w:iCs w:val="0"/>
+                <w:color w:val="000000"/>
+                <w:kern w:val="0"/>
+                <w:sz w:val="22"/>
+                <w:szCs w:val="22"/>
+                <w:u w:val="none"/>
+                <w:lang w:val="en-US" w:eastAsia="zh-CN" w:bidi="ar"/>
+              </w:rPr>
+              <w:t>0.518</w:t>
+            </w:r>
+          </w:p>
+        </w:tc>
+        <w:tc>
+          <w:tcPr>
+            <w:tcW w:w="870" w:type="dxa"/>
             <w:tcBorders>
               <w:top w:val="nil"/>
               <w:left w:val="nil"/>
@@ -15380,7 +15098,6 @@
             <w:r>
               <w:rPr>
                 <w:rFonts w:hint="eastAsia" w:ascii="宋体" w:hAnsi="宋体" w:eastAsia="宋体" w:cs="宋体"/>
-                <w:b w:val="0"/>
                 <w:i w:val="0"/>
                 <w:iCs w:val="0"/>
                 <w:color w:val="000000"/>
@@ -15432,7 +15149,7 @@
         </w:tc>
         <w:tc>
           <w:tcPr>
-            <w:tcW w:w="356" w:type="pct"/>
+            <w:tcW w:w="1009" w:type="dxa"/>
             <w:tcBorders>
               <w:top w:val="nil"/>
               <w:left w:val="nil"/>
@@ -15465,23 +15182,22 @@
             <w:r>
               <w:rPr>
                 <w:rFonts w:hint="eastAsia" w:ascii="宋体" w:hAnsi="宋体" w:eastAsia="宋体" w:cs="宋体"/>
-                <w:b w:val="0"/>
-                <w:i w:val="0"/>
-                <w:iCs w:val="0"/>
-                <w:color w:val="000000"/>
-                <w:kern w:val="0"/>
-                <w:sz w:val="22"/>
-                <w:szCs w:val="22"/>
-                <w:u w:val="none"/>
-                <w:lang w:val="en-US" w:eastAsia="zh-CN" w:bidi="ar"/>
-              </w:rPr>
-              <w:t>0.017</w:t>
-            </w:r>
-          </w:p>
-        </w:tc>
-        <w:tc>
-          <w:tcPr>
-            <w:tcW w:w="389" w:type="pct"/>
+                <w:i w:val="0"/>
+                <w:iCs w:val="0"/>
+                <w:color w:val="000000"/>
+                <w:kern w:val="0"/>
+                <w:sz w:val="22"/>
+                <w:szCs w:val="22"/>
+                <w:u w:val="none"/>
+                <w:lang w:val="en-US" w:eastAsia="zh-CN" w:bidi="ar"/>
+              </w:rPr>
+              <w:t>0.014</w:t>
+            </w:r>
+          </w:p>
+        </w:tc>
+        <w:tc>
+          <w:tcPr>
+            <w:tcW w:w="1103" w:type="dxa"/>
             <w:tcBorders>
               <w:top w:val="nil"/>
               <w:left w:val="nil"/>
@@ -15514,23 +15230,22 @@
             <w:r>
               <w:rPr>
                 <w:rFonts w:hint="eastAsia" w:ascii="宋体" w:hAnsi="宋体" w:eastAsia="宋体" w:cs="宋体"/>
-                <w:b w:val="0"/>
-                <w:i w:val="0"/>
-                <w:iCs w:val="0"/>
-                <w:color w:val="000000"/>
-                <w:kern w:val="0"/>
-                <w:sz w:val="22"/>
-                <w:szCs w:val="22"/>
-                <w:u w:val="none"/>
-                <w:lang w:val="en-US" w:eastAsia="zh-CN" w:bidi="ar"/>
-              </w:rPr>
-              <w:t>0.230</w:t>
-            </w:r>
-          </w:p>
-        </w:tc>
-        <w:tc>
-          <w:tcPr>
-            <w:tcW w:w="332" w:type="pct"/>
+                <w:i w:val="0"/>
+                <w:iCs w:val="0"/>
+                <w:color w:val="000000"/>
+                <w:kern w:val="0"/>
+                <w:sz w:val="22"/>
+                <w:szCs w:val="22"/>
+                <w:u w:val="none"/>
+                <w:lang w:val="en-US" w:eastAsia="zh-CN" w:bidi="ar"/>
+              </w:rPr>
+              <w:t>0.19</w:t>
+            </w:r>
+          </w:p>
+        </w:tc>
+        <w:tc>
+          <w:tcPr>
+            <w:tcW w:w="941" w:type="dxa"/>
             <w:tcBorders>
               <w:top w:val="nil"/>
               <w:left w:val="nil"/>
@@ -15563,23 +15278,22 @@
             <w:r>
               <w:rPr>
                 <w:rFonts w:hint="eastAsia" w:ascii="宋体" w:hAnsi="宋体" w:eastAsia="宋体" w:cs="宋体"/>
-                <w:b w:val="0"/>
-                <w:i w:val="0"/>
-                <w:iCs w:val="0"/>
-                <w:color w:val="000000"/>
-                <w:kern w:val="0"/>
-                <w:sz w:val="22"/>
-                <w:szCs w:val="22"/>
-                <w:u w:val="none"/>
-                <w:lang w:val="en-US" w:eastAsia="zh-CN" w:bidi="ar"/>
-              </w:rPr>
-              <w:t>.000</w:t>
-            </w:r>
-          </w:p>
-        </w:tc>
-        <w:tc>
-          <w:tcPr>
-            <w:tcW w:w="305" w:type="pct"/>
+                <w:i w:val="0"/>
+                <w:iCs w:val="0"/>
+                <w:color w:val="000000"/>
+                <w:kern w:val="0"/>
+                <w:sz w:val="22"/>
+                <w:szCs w:val="22"/>
+                <w:u w:val="none"/>
+                <w:lang w:val="en-US" w:eastAsia="zh-CN" w:bidi="ar"/>
+              </w:rPr>
+              <w:t>0.849</w:t>
+            </w:r>
+          </w:p>
+        </w:tc>
+        <w:tc>
+          <w:tcPr>
+            <w:tcW w:w="870" w:type="dxa"/>
             <w:tcBorders>
               <w:top w:val="nil"/>
               <w:left w:val="nil"/>
@@ -15612,7 +15326,6 @@
             <w:r>
               <w:rPr>
                 <w:rFonts w:hint="eastAsia" w:ascii="宋体" w:hAnsi="宋体" w:eastAsia="宋体" w:cs="宋体"/>
-                <w:b w:val="0"/>
                 <w:i w:val="0"/>
                 <w:iCs w:val="0"/>
                 <w:color w:val="000000"/>
@@ -15664,7 +15377,7 @@
         </w:tc>
         <w:tc>
           <w:tcPr>
-            <w:tcW w:w="356" w:type="pct"/>
+            <w:tcW w:w="1009" w:type="dxa"/>
             <w:tcBorders>
               <w:top w:val="nil"/>
               <w:left w:val="nil"/>
@@ -15697,23 +15410,22 @@
             <w:r>
               <w:rPr>
                 <w:rFonts w:hint="eastAsia" w:ascii="宋体" w:hAnsi="宋体" w:eastAsia="宋体" w:cs="宋体"/>
-                <w:b w:val="0"/>
-                <w:i w:val="0"/>
-                <w:iCs w:val="0"/>
-                <w:color w:val="000000"/>
-                <w:kern w:val="0"/>
-                <w:sz w:val="22"/>
-                <w:szCs w:val="22"/>
-                <w:u w:val="none"/>
-                <w:lang w:val="en-US" w:eastAsia="zh-CN" w:bidi="ar"/>
-              </w:rPr>
-              <w:t>0.010</w:t>
-            </w:r>
-          </w:p>
-        </w:tc>
-        <w:tc>
-          <w:tcPr>
-            <w:tcW w:w="389" w:type="pct"/>
+                <w:i w:val="0"/>
+                <w:iCs w:val="0"/>
+                <w:color w:val="000000"/>
+                <w:kern w:val="0"/>
+                <w:sz w:val="22"/>
+                <w:szCs w:val="22"/>
+                <w:u w:val="none"/>
+                <w:lang w:val="en-US" w:eastAsia="zh-CN" w:bidi="ar"/>
+              </w:rPr>
+              <w:t>0.007</w:t>
+            </w:r>
+          </w:p>
+        </w:tc>
+        <w:tc>
+          <w:tcPr>
+            <w:tcW w:w="1103" w:type="dxa"/>
             <w:tcBorders>
               <w:top w:val="nil"/>
               <w:left w:val="nil"/>
@@ -15746,23 +15458,22 @@
             <w:r>
               <w:rPr>
                 <w:rFonts w:hint="eastAsia" w:ascii="宋体" w:hAnsi="宋体" w:eastAsia="宋体" w:cs="宋体"/>
-                <w:b w:val="0"/>
-                <w:i w:val="0"/>
-                <w:iCs w:val="0"/>
-                <w:color w:val="000000"/>
-                <w:kern w:val="0"/>
-                <w:sz w:val="22"/>
-                <w:szCs w:val="22"/>
-                <w:u w:val="none"/>
-                <w:lang w:val="en-US" w:eastAsia="zh-CN" w:bidi="ar"/>
-              </w:rPr>
-              <w:t>0.130</w:t>
-            </w:r>
-          </w:p>
-        </w:tc>
-        <w:tc>
-          <w:tcPr>
-            <w:tcW w:w="332" w:type="pct"/>
+                <w:i w:val="0"/>
+                <w:iCs w:val="0"/>
+                <w:color w:val="000000"/>
+                <w:kern w:val="0"/>
+                <w:sz w:val="22"/>
+                <w:szCs w:val="22"/>
+                <w:u w:val="none"/>
+                <w:lang w:val="en-US" w:eastAsia="zh-CN" w:bidi="ar"/>
+              </w:rPr>
+              <w:t>0.098</w:t>
+            </w:r>
+          </w:p>
+        </w:tc>
+        <w:tc>
+          <w:tcPr>
+            <w:tcW w:w="942" w:type="dxa"/>
             <w:tcBorders>
               <w:top w:val="nil"/>
               <w:left w:val="nil"/>
@@ -15794,39 +15505,23 @@
             </w:pPr>
             <w:r>
               <w:rPr>
-                <w:rFonts w:hint="default" w:ascii="宋体" w:hAnsi="宋体" w:eastAsia="宋体" w:cs="宋体"/>
-                <w:b w:val="0"/>
-                <w:i w:val="0"/>
-                <w:iCs w:val="0"/>
-                <w:color w:val="000000"/>
-                <w:kern w:val="0"/>
-                <w:sz w:val="22"/>
-                <w:szCs w:val="22"/>
-                <w:u w:val="none"/>
-                <w:lang w:val="en-US" w:eastAsia="zh-CN" w:bidi="ar"/>
-              </w:rPr>
-              <w:t xml:space="preserve">&lt; </w:t>
-            </w:r>
-            <w:r>
-              <w:rPr>
-                <w:rFonts w:hint="eastAsia" w:ascii="宋体" w:hAnsi="宋体" w:eastAsia="宋体" w:cs="宋体"/>
-                <w:b w:val="0"/>
-                <w:i w:val="0"/>
-                <w:iCs w:val="0"/>
-                <w:color w:val="000000"/>
-                <w:kern w:val="0"/>
-                <w:sz w:val="22"/>
-                <w:szCs w:val="22"/>
-                <w:u w:val="none"/>
-                <w:lang w:val="en-US" w:eastAsia="zh-CN" w:bidi="ar"/>
-              </w:rPr>
-              <w:t>.000</w:t>
-            </w:r>
-          </w:p>
-        </w:tc>
-        <w:tc>
-          <w:tcPr>
-            <w:tcW w:w="305" w:type="pct"/>
+                <w:rFonts w:hint="eastAsia" w:ascii="宋体" w:hAnsi="宋体" w:eastAsia="宋体" w:cs="宋体"/>
+                <w:i w:val="0"/>
+                <w:iCs w:val="0"/>
+                <w:color w:val="000000"/>
+                <w:kern w:val="0"/>
+                <w:sz w:val="22"/>
+                <w:szCs w:val="22"/>
+                <w:u w:val="none"/>
+                <w:lang w:val="en-US" w:eastAsia="zh-CN" w:bidi="ar"/>
+              </w:rPr>
+              <w:t>0.922</w:t>
+            </w:r>
+          </w:p>
+        </w:tc>
+        <w:tc>
+          <w:tcPr>
+            <w:tcW w:w="871" w:type="dxa"/>
             <w:tcBorders>
               <w:top w:val="nil"/>
               <w:left w:val="nil"/>
@@ -15859,7 +15554,6 @@
             <w:r>
               <w:rPr>
                 <w:rFonts w:hint="eastAsia" w:ascii="宋体" w:hAnsi="宋体" w:eastAsia="宋体" w:cs="宋体"/>
-                <w:b w:val="0"/>
                 <w:i w:val="0"/>
                 <w:iCs w:val="0"/>
                 <w:color w:val="000000"/>
@@ -15929,7 +15623,7 @@
         </w:tc>
         <w:tc>
           <w:tcPr>
-            <w:tcW w:w="356" w:type="pct"/>
+            <w:tcW w:w="1009" w:type="dxa"/>
             <w:tcBorders>
               <w:top w:val="nil"/>
               <w:left w:val="nil"/>
@@ -15962,23 +15656,22 @@
             <w:r>
               <w:rPr>
                 <w:rFonts w:hint="eastAsia" w:ascii="宋体" w:hAnsi="宋体" w:eastAsia="宋体" w:cs="宋体"/>
-                <w:b w:val="0"/>
-                <w:i w:val="0"/>
-                <w:iCs w:val="0"/>
-                <w:color w:val="000000"/>
-                <w:kern w:val="0"/>
-                <w:sz w:val="22"/>
-                <w:szCs w:val="22"/>
-                <w:u w:val="none"/>
-                <w:lang w:val="en-US" w:eastAsia="zh-CN" w:bidi="ar"/>
-              </w:rPr>
-              <w:t>0.100</w:t>
-            </w:r>
-          </w:p>
-        </w:tc>
-        <w:tc>
-          <w:tcPr>
-            <w:tcW w:w="389" w:type="pct"/>
+                <w:i w:val="0"/>
+                <w:iCs w:val="0"/>
+                <w:color w:val="000000"/>
+                <w:kern w:val="0"/>
+                <w:sz w:val="22"/>
+                <w:szCs w:val="22"/>
+                <w:u w:val="none"/>
+                <w:lang w:val="en-US" w:eastAsia="zh-CN" w:bidi="ar"/>
+              </w:rPr>
+              <w:t>0.037</w:t>
+            </w:r>
+          </w:p>
+        </w:tc>
+        <w:tc>
+          <w:tcPr>
+            <w:tcW w:w="1103" w:type="dxa"/>
             <w:tcBorders>
               <w:top w:val="nil"/>
               <w:left w:val="nil"/>
@@ -16011,23 +15704,22 @@
             <w:r>
               <w:rPr>
                 <w:rFonts w:hint="eastAsia" w:ascii="宋体" w:hAnsi="宋体" w:eastAsia="宋体" w:cs="宋体"/>
-                <w:b w:val="0"/>
-                <w:i w:val="0"/>
-                <w:iCs w:val="0"/>
-                <w:color w:val="000000"/>
-                <w:kern w:val="0"/>
-                <w:sz w:val="22"/>
-                <w:szCs w:val="22"/>
-                <w:u w:val="none"/>
-                <w:lang w:val="en-US" w:eastAsia="zh-CN" w:bidi="ar"/>
-              </w:rPr>
-              <w:t>1.712</w:t>
-            </w:r>
-          </w:p>
-        </w:tc>
-        <w:tc>
-          <w:tcPr>
-            <w:tcW w:w="332" w:type="pct"/>
+                <w:i w:val="0"/>
+                <w:iCs w:val="0"/>
+                <w:color w:val="000000"/>
+                <w:kern w:val="0"/>
+                <w:sz w:val="22"/>
+                <w:szCs w:val="22"/>
+                <w:u w:val="none"/>
+                <w:lang w:val="en-US" w:eastAsia="zh-CN" w:bidi="ar"/>
+              </w:rPr>
+              <w:t>0.64</w:t>
+            </w:r>
+          </w:p>
+        </w:tc>
+        <w:tc>
+          <w:tcPr>
+            <w:tcW w:w="941" w:type="dxa"/>
             <w:tcBorders>
               <w:top w:val="nil"/>
               <w:left w:val="nil"/>
@@ -16060,23 +15752,22 @@
             <w:r>
               <w:rPr>
                 <w:rFonts w:hint="eastAsia" w:ascii="宋体" w:hAnsi="宋体" w:eastAsia="宋体" w:cs="宋体"/>
-                <w:b w:val="0"/>
-                <w:i w:val="0"/>
-                <w:iCs w:val="0"/>
-                <w:color w:val="000000"/>
-                <w:kern w:val="0"/>
-                <w:sz w:val="22"/>
-                <w:szCs w:val="22"/>
-                <w:u w:val="none"/>
-                <w:lang w:val="en-US" w:eastAsia="zh-CN" w:bidi="ar"/>
-              </w:rPr>
-              <w:t>.008</w:t>
-            </w:r>
-          </w:p>
-        </w:tc>
-        <w:tc>
-          <w:tcPr>
-            <w:tcW w:w="305" w:type="pct"/>
+                <w:i w:val="0"/>
+                <w:iCs w:val="0"/>
+                <w:color w:val="000000"/>
+                <w:kern w:val="0"/>
+                <w:sz w:val="22"/>
+                <w:szCs w:val="22"/>
+                <w:u w:val="none"/>
+                <w:lang w:val="en-US" w:eastAsia="zh-CN" w:bidi="ar"/>
+              </w:rPr>
+              <w:t>0.522</w:t>
+            </w:r>
+          </w:p>
+        </w:tc>
+        <w:tc>
+          <w:tcPr>
+            <w:tcW w:w="870" w:type="dxa"/>
             <w:tcBorders>
               <w:top w:val="nil"/>
               <w:left w:val="nil"/>
@@ -16109,7 +15800,6 @@
             <w:r>
               <w:rPr>
                 <w:rFonts w:hint="eastAsia" w:ascii="宋体" w:hAnsi="宋体" w:eastAsia="宋体" w:cs="宋体"/>
-                <w:b w:val="0"/>
                 <w:i w:val="0"/>
                 <w:iCs w:val="0"/>
                 <w:color w:val="000000"/>
@@ -16161,7 +15851,7 @@
         </w:tc>
         <w:tc>
           <w:tcPr>
-            <w:tcW w:w="356" w:type="pct"/>
+            <w:tcW w:w="1009" w:type="dxa"/>
             <w:tcBorders>
               <w:top w:val="nil"/>
               <w:left w:val="nil"/>
@@ -16194,23 +15884,22 @@
             <w:r>
               <w:rPr>
                 <w:rFonts w:hint="eastAsia" w:ascii="宋体" w:hAnsi="宋体" w:eastAsia="宋体" w:cs="宋体"/>
-                <w:b w:val="0"/>
-                <w:i w:val="0"/>
-                <w:iCs w:val="0"/>
-                <w:color w:val="000000"/>
-                <w:kern w:val="0"/>
-                <w:sz w:val="22"/>
-                <w:szCs w:val="22"/>
-                <w:u w:val="none"/>
-                <w:lang w:val="en-US" w:eastAsia="zh-CN" w:bidi="ar"/>
-              </w:rPr>
-              <w:t>0.058</w:t>
-            </w:r>
-          </w:p>
-        </w:tc>
-        <w:tc>
-          <w:tcPr>
-            <w:tcW w:w="389" w:type="pct"/>
+                <w:i w:val="0"/>
+                <w:iCs w:val="0"/>
+                <w:color w:val="000000"/>
+                <w:kern w:val="0"/>
+                <w:sz w:val="22"/>
+                <w:szCs w:val="22"/>
+                <w:u w:val="none"/>
+                <w:lang w:val="en-US" w:eastAsia="zh-CN" w:bidi="ar"/>
+              </w:rPr>
+              <w:t>-0.014</w:t>
+            </w:r>
+          </w:p>
+        </w:tc>
+        <w:tc>
+          <w:tcPr>
+            <w:tcW w:w="1103" w:type="dxa"/>
             <w:tcBorders>
               <w:top w:val="nil"/>
               <w:left w:val="nil"/>
@@ -16243,23 +15932,22 @@
             <w:r>
               <w:rPr>
                 <w:rFonts w:hint="eastAsia" w:ascii="宋体" w:hAnsi="宋体" w:eastAsia="宋体" w:cs="宋体"/>
-                <w:b w:val="0"/>
-                <w:i w:val="0"/>
-                <w:iCs w:val="0"/>
-                <w:color w:val="000000"/>
-                <w:kern w:val="0"/>
-                <w:sz w:val="22"/>
-                <w:szCs w:val="22"/>
-                <w:u w:val="none"/>
-                <w:lang w:val="en-US" w:eastAsia="zh-CN" w:bidi="ar"/>
-              </w:rPr>
-              <w:t>1.028</w:t>
-            </w:r>
-          </w:p>
-        </w:tc>
-        <w:tc>
-          <w:tcPr>
-            <w:tcW w:w="332" w:type="pct"/>
+                <w:i w:val="0"/>
+                <w:iCs w:val="0"/>
+                <w:color w:val="000000"/>
+                <w:kern w:val="0"/>
+                <w:sz w:val="22"/>
+                <w:szCs w:val="22"/>
+                <w:u w:val="none"/>
+                <w:lang w:val="en-US" w:eastAsia="zh-CN" w:bidi="ar"/>
+              </w:rPr>
+              <w:t>-0.256</w:t>
+            </w:r>
+          </w:p>
+        </w:tc>
+        <w:tc>
+          <w:tcPr>
+            <w:tcW w:w="941" w:type="dxa"/>
             <w:tcBorders>
               <w:top w:val="nil"/>
               <w:left w:val="nil"/>
@@ -16292,23 +15980,22 @@
             <w:r>
               <w:rPr>
                 <w:rFonts w:hint="eastAsia" w:ascii="宋体" w:hAnsi="宋体" w:eastAsia="宋体" w:cs="宋体"/>
-                <w:b w:val="0"/>
-                <w:i w:val="0"/>
-                <w:iCs w:val="0"/>
-                <w:color w:val="000000"/>
-                <w:kern w:val="0"/>
-                <w:sz w:val="22"/>
-                <w:szCs w:val="22"/>
-                <w:u w:val="none"/>
-                <w:lang w:val="en-US" w:eastAsia="zh-CN" w:bidi="ar"/>
-              </w:rPr>
-              <w:t>.003</w:t>
-            </w:r>
-          </w:p>
-        </w:tc>
-        <w:tc>
-          <w:tcPr>
-            <w:tcW w:w="305" w:type="pct"/>
+                <w:i w:val="0"/>
+                <w:iCs w:val="0"/>
+                <w:color w:val="000000"/>
+                <w:kern w:val="0"/>
+                <w:sz w:val="22"/>
+                <w:szCs w:val="22"/>
+                <w:u w:val="none"/>
+                <w:lang w:val="en-US" w:eastAsia="zh-CN" w:bidi="ar"/>
+              </w:rPr>
+              <w:t>0.798</w:t>
+            </w:r>
+          </w:p>
+        </w:tc>
+        <w:tc>
+          <w:tcPr>
+            <w:tcW w:w="870" w:type="dxa"/>
             <w:tcBorders>
               <w:top w:val="nil"/>
               <w:left w:val="nil"/>
@@ -16341,7 +16028,6 @@
             <w:r>
               <w:rPr>
                 <w:rFonts w:hint="eastAsia" w:ascii="宋体" w:hAnsi="宋体" w:eastAsia="宋体" w:cs="宋体"/>
-                <w:b w:val="0"/>
                 <w:i w:val="0"/>
                 <w:iCs w:val="0"/>
                 <w:color w:val="000000"/>
@@ -16393,7 +16079,7 @@
         </w:tc>
         <w:tc>
           <w:tcPr>
-            <w:tcW w:w="356" w:type="pct"/>
+            <w:tcW w:w="1009" w:type="dxa"/>
             <w:tcBorders>
               <w:top w:val="nil"/>
               <w:left w:val="nil"/>
@@ -16426,23 +16112,22 @@
             <w:r>
               <w:rPr>
                 <w:rFonts w:hint="eastAsia" w:ascii="宋体" w:hAnsi="宋体" w:eastAsia="宋体" w:cs="宋体"/>
-                <w:b w:val="0"/>
-                <w:i w:val="0"/>
-                <w:iCs w:val="0"/>
-                <w:color w:val="000000"/>
-                <w:kern w:val="0"/>
-                <w:sz w:val="22"/>
-                <w:szCs w:val="22"/>
-                <w:u w:val="none"/>
-                <w:lang w:val="en-US" w:eastAsia="zh-CN" w:bidi="ar"/>
-              </w:rPr>
-              <w:t>0.071</w:t>
-            </w:r>
-          </w:p>
-        </w:tc>
-        <w:tc>
-          <w:tcPr>
-            <w:tcW w:w="389" w:type="pct"/>
+                <w:i w:val="0"/>
+                <w:iCs w:val="0"/>
+                <w:color w:val="000000"/>
+                <w:kern w:val="0"/>
+                <w:sz w:val="22"/>
+                <w:szCs w:val="22"/>
+                <w:u w:val="none"/>
+                <w:lang w:val="en-US" w:eastAsia="zh-CN" w:bidi="ar"/>
+              </w:rPr>
+              <w:t>-0.002</w:t>
+            </w:r>
+          </w:p>
+        </w:tc>
+        <w:tc>
+          <w:tcPr>
+            <w:tcW w:w="1103" w:type="dxa"/>
             <w:tcBorders>
               <w:top w:val="nil"/>
               <w:left w:val="nil"/>
@@ -16475,23 +16160,22 @@
             <w:r>
               <w:rPr>
                 <w:rFonts w:hint="eastAsia" w:ascii="宋体" w:hAnsi="宋体" w:eastAsia="宋体" w:cs="宋体"/>
-                <w:b w:val="0"/>
-                <w:i w:val="0"/>
-                <w:iCs w:val="0"/>
-                <w:color w:val="000000"/>
-                <w:kern w:val="0"/>
-                <w:sz w:val="22"/>
-                <w:szCs w:val="22"/>
-                <w:u w:val="none"/>
-                <w:lang w:val="en-US" w:eastAsia="zh-CN" w:bidi="ar"/>
-              </w:rPr>
-              <w:t>1.262</w:t>
-            </w:r>
-          </w:p>
-        </w:tc>
-        <w:tc>
-          <w:tcPr>
-            <w:tcW w:w="332" w:type="pct"/>
+                <w:i w:val="0"/>
+                <w:iCs w:val="0"/>
+                <w:color w:val="000000"/>
+                <w:kern w:val="0"/>
+                <w:sz w:val="22"/>
+                <w:szCs w:val="22"/>
+                <w:u w:val="none"/>
+                <w:lang w:val="en-US" w:eastAsia="zh-CN" w:bidi="ar"/>
+              </w:rPr>
+              <w:t>-0.044</w:t>
+            </w:r>
+          </w:p>
+        </w:tc>
+        <w:tc>
+          <w:tcPr>
+            <w:tcW w:w="942" w:type="dxa"/>
             <w:tcBorders>
               <w:top w:val="nil"/>
               <w:left w:val="nil"/>
@@ -16524,23 +16208,22 @@
             <w:r>
               <w:rPr>
                 <w:rFonts w:hint="eastAsia" w:ascii="宋体" w:hAnsi="宋体" w:eastAsia="宋体" w:cs="宋体"/>
-                <w:b w:val="0"/>
-                <w:i w:val="0"/>
-                <w:iCs w:val="0"/>
-                <w:color w:val="000000"/>
-                <w:kern w:val="0"/>
-                <w:sz w:val="22"/>
-                <w:szCs w:val="22"/>
-                <w:u w:val="none"/>
-                <w:lang w:val="en-US" w:eastAsia="zh-CN" w:bidi="ar"/>
-              </w:rPr>
-              <w:t>.004</w:t>
-            </w:r>
-          </w:p>
-        </w:tc>
-        <w:tc>
-          <w:tcPr>
-            <w:tcW w:w="305" w:type="pct"/>
+                <w:i w:val="0"/>
+                <w:iCs w:val="0"/>
+                <w:color w:val="000000"/>
+                <w:kern w:val="0"/>
+                <w:sz w:val="22"/>
+                <w:szCs w:val="22"/>
+                <w:u w:val="none"/>
+                <w:lang w:val="en-US" w:eastAsia="zh-CN" w:bidi="ar"/>
+              </w:rPr>
+              <w:t>0.965</w:t>
+            </w:r>
+          </w:p>
+        </w:tc>
+        <w:tc>
+          <w:tcPr>
+            <w:tcW w:w="871" w:type="dxa"/>
             <w:tcBorders>
               <w:top w:val="nil"/>
               <w:left w:val="nil"/>
@@ -16573,7 +16256,6 @@
             <w:r>
               <w:rPr>
                 <w:rFonts w:hint="eastAsia" w:ascii="宋体" w:hAnsi="宋体" w:eastAsia="宋体" w:cs="宋体"/>
-                <w:b w:val="0"/>
                 <w:i w:val="0"/>
                 <w:iCs w:val="0"/>
                 <w:color w:val="000000"/>
@@ -16788,7 +16470,7 @@
         </w:tc>
         <w:tc>
           <w:tcPr>
-            <w:tcW w:w="356" w:type="pct"/>
+            <w:tcW w:w="1009" w:type="dxa"/>
             <w:tcBorders>
               <w:top w:val="nil"/>
               <w:left w:val="nil"/>
@@ -16821,23 +16503,22 @@
             <w:r>
               <w:rPr>
                 <w:rFonts w:hint="eastAsia" w:ascii="宋体" w:hAnsi="宋体" w:eastAsia="宋体" w:cs="宋体"/>
-                <w:b w:val="0"/>
-                <w:i w:val="0"/>
-                <w:iCs w:val="0"/>
-                <w:color w:val="000000"/>
-                <w:kern w:val="0"/>
-                <w:sz w:val="22"/>
-                <w:szCs w:val="22"/>
-                <w:u w:val="none"/>
-                <w:lang w:val="en-US" w:eastAsia="zh-CN" w:bidi="ar"/>
-              </w:rPr>
-              <w:t>0.238</w:t>
-            </w:r>
-          </w:p>
-        </w:tc>
-        <w:tc>
-          <w:tcPr>
-            <w:tcW w:w="389" w:type="pct"/>
+                <w:i w:val="0"/>
+                <w:iCs w:val="0"/>
+                <w:color w:val="000000"/>
+                <w:kern w:val="0"/>
+                <w:sz w:val="22"/>
+                <w:szCs w:val="22"/>
+                <w:u w:val="none"/>
+                <w:lang w:val="en-US" w:eastAsia="zh-CN" w:bidi="ar"/>
+              </w:rPr>
+              <w:t>0.279</w:t>
+            </w:r>
+          </w:p>
+        </w:tc>
+        <w:tc>
+          <w:tcPr>
+            <w:tcW w:w="1103" w:type="dxa"/>
             <w:tcBorders>
               <w:top w:val="nil"/>
               <w:left w:val="nil"/>
@@ -16870,39 +16551,22 @@
             <w:r>
               <w:rPr>
                 <w:rFonts w:hint="eastAsia" w:ascii="宋体" w:hAnsi="宋体" w:eastAsia="宋体" w:cs="宋体"/>
-                <w:b w:val="0"/>
-                <w:i w:val="0"/>
-                <w:iCs w:val="0"/>
-                <w:color w:val="000000"/>
-                <w:kern w:val="0"/>
-                <w:sz w:val="22"/>
-                <w:szCs w:val="22"/>
-                <w:u w:val="none"/>
-                <w:lang w:val="en-US" w:eastAsia="zh-CN" w:bidi="ar"/>
-              </w:rPr>
-              <w:t>4.628</w:t>
-            </w:r>
-            <w:r>
-              <w:rPr>
-                <w:rFonts w:hint="eastAsia" w:ascii="宋体" w:hAnsi="宋体" w:eastAsia="宋体" w:cs="宋体"/>
-                <w:b w:val="0"/>
-                <w:i w:val="0"/>
-                <w:iCs w:val="0"/>
-                <w:color w:val="000000"/>
-                <w:kern w:val="0"/>
-                <w:sz w:val="22"/>
-                <w:szCs w:val="22"/>
-                <w:u w:val="none"/>
-                <w:vertAlign w:val="superscript"/>
-                <w:lang w:val="en-US" w:eastAsia="zh-CN" w:bidi="ar"/>
-              </w:rPr>
-              <w:t>***</w:t>
-            </w:r>
-          </w:p>
-        </w:tc>
-        <w:tc>
-          <w:tcPr>
-            <w:tcW w:w="332" w:type="pct"/>
+                <w:i w:val="0"/>
+                <w:iCs w:val="0"/>
+                <w:color w:val="000000"/>
+                <w:kern w:val="0"/>
+                <w:sz w:val="22"/>
+                <w:szCs w:val="22"/>
+                <w:u w:val="none"/>
+                <w:lang w:val="en-US" w:eastAsia="zh-CN" w:bidi="ar"/>
+              </w:rPr>
+              <w:t>5.538</w:t>
+            </w:r>
+          </w:p>
+        </w:tc>
+        <w:tc>
+          <w:tcPr>
+            <w:tcW w:w="941" w:type="dxa"/>
             <w:tcBorders>
               <w:top w:val="nil"/>
               <w:left w:val="nil"/>
@@ -16935,23 +16599,22 @@
             <w:r>
               <w:rPr>
                 <w:rFonts w:hint="eastAsia" w:ascii="宋体" w:hAnsi="宋体" w:eastAsia="宋体" w:cs="宋体"/>
-                <w:b w:val="0"/>
-                <w:i w:val="0"/>
-                <w:iCs w:val="0"/>
-                <w:color w:val="000000"/>
-                <w:kern w:val="0"/>
-                <w:sz w:val="22"/>
-                <w:szCs w:val="22"/>
-                <w:u w:val="none"/>
-                <w:lang w:val="en-US" w:eastAsia="zh-CN" w:bidi="ar"/>
-              </w:rPr>
-              <w:t>.057</w:t>
-            </w:r>
-          </w:p>
-        </w:tc>
-        <w:tc>
-          <w:tcPr>
-            <w:tcW w:w="305" w:type="pct"/>
+                <w:i w:val="0"/>
+                <w:iCs w:val="0"/>
+                <w:color w:val="000000"/>
+                <w:kern w:val="0"/>
+                <w:sz w:val="22"/>
+                <w:szCs w:val="22"/>
+                <w:u w:val="none"/>
+                <w:lang w:val="en-US" w:eastAsia="zh-CN" w:bidi="ar"/>
+              </w:rPr>
+              <w:t>&lt;0.001</w:t>
+            </w:r>
+          </w:p>
+        </w:tc>
+        <w:tc>
+          <w:tcPr>
+            <w:tcW w:w="870" w:type="dxa"/>
             <w:tcBorders>
               <w:top w:val="nil"/>
               <w:left w:val="nil"/>
@@ -16984,7 +16647,6 @@
             <w:r>
               <w:rPr>
                 <w:rFonts w:hint="eastAsia" w:ascii="宋体" w:hAnsi="宋体" w:eastAsia="宋体" w:cs="宋体"/>
-                <w:b w:val="0"/>
                 <w:i w:val="0"/>
                 <w:iCs w:val="0"/>
                 <w:color w:val="000000"/>
@@ -17036,7 +16698,7 @@
         </w:tc>
         <w:tc>
           <w:tcPr>
-            <w:tcW w:w="356" w:type="pct"/>
+            <w:tcW w:w="1009" w:type="dxa"/>
             <w:tcBorders>
               <w:top w:val="nil"/>
               <w:left w:val="nil"/>
@@ -17069,23 +16731,22 @@
             <w:r>
               <w:rPr>
                 <w:rFonts w:hint="eastAsia" w:ascii="宋体" w:hAnsi="宋体" w:eastAsia="宋体" w:cs="宋体"/>
-                <w:b w:val="0"/>
-                <w:i w:val="0"/>
-                <w:iCs w:val="0"/>
-                <w:color w:val="000000"/>
-                <w:kern w:val="0"/>
-                <w:sz w:val="22"/>
-                <w:szCs w:val="22"/>
-                <w:u w:val="none"/>
-                <w:lang w:val="en-US" w:eastAsia="zh-CN" w:bidi="ar"/>
-              </w:rPr>
-              <w:t>0.245</w:t>
-            </w:r>
-          </w:p>
-        </w:tc>
-        <w:tc>
-          <w:tcPr>
-            <w:tcW w:w="389" w:type="pct"/>
+                <w:i w:val="0"/>
+                <w:iCs w:val="0"/>
+                <w:color w:val="000000"/>
+                <w:kern w:val="0"/>
+                <w:sz w:val="22"/>
+                <w:szCs w:val="22"/>
+                <w:u w:val="none"/>
+                <w:lang w:val="en-US" w:eastAsia="zh-CN" w:bidi="ar"/>
+              </w:rPr>
+              <w:t>0.285</w:t>
+            </w:r>
+          </w:p>
+        </w:tc>
+        <w:tc>
+          <w:tcPr>
+            <w:tcW w:w="1103" w:type="dxa"/>
             <w:tcBorders>
               <w:top w:val="nil"/>
               <w:left w:val="nil"/>
@@ -17118,39 +16779,22 @@
             <w:r>
               <w:rPr>
                 <w:rFonts w:hint="eastAsia" w:ascii="宋体" w:hAnsi="宋体" w:eastAsia="宋体" w:cs="宋体"/>
-                <w:b w:val="0"/>
-                <w:i w:val="0"/>
-                <w:iCs w:val="0"/>
-                <w:color w:val="000000"/>
-                <w:kern w:val="0"/>
-                <w:sz w:val="22"/>
-                <w:szCs w:val="22"/>
-                <w:u w:val="none"/>
-                <w:lang w:val="en-US" w:eastAsia="zh-CN" w:bidi="ar"/>
-              </w:rPr>
-              <w:t>4.783</w:t>
-            </w:r>
-            <w:r>
-              <w:rPr>
-                <w:rFonts w:hint="eastAsia" w:ascii="宋体" w:hAnsi="宋体" w:eastAsia="宋体" w:cs="宋体"/>
-                <w:b w:val="0"/>
-                <w:i w:val="0"/>
-                <w:iCs w:val="0"/>
-                <w:color w:val="000000"/>
-                <w:kern w:val="0"/>
-                <w:sz w:val="22"/>
-                <w:szCs w:val="22"/>
-                <w:u w:val="none"/>
-                <w:vertAlign w:val="superscript"/>
-                <w:lang w:val="en-US" w:eastAsia="zh-CN" w:bidi="ar"/>
-              </w:rPr>
-              <w:t>***</w:t>
-            </w:r>
-          </w:p>
-        </w:tc>
-        <w:tc>
-          <w:tcPr>
-            <w:tcW w:w="332" w:type="pct"/>
+                <w:i w:val="0"/>
+                <w:iCs w:val="0"/>
+                <w:color w:val="000000"/>
+                <w:kern w:val="0"/>
+                <w:sz w:val="22"/>
+                <w:szCs w:val="22"/>
+                <w:u w:val="none"/>
+                <w:lang w:val="en-US" w:eastAsia="zh-CN" w:bidi="ar"/>
+              </w:rPr>
+              <w:t>5.677</w:t>
+            </w:r>
+          </w:p>
+        </w:tc>
+        <w:tc>
+          <w:tcPr>
+            <w:tcW w:w="942" w:type="dxa"/>
             <w:tcBorders>
               <w:top w:val="nil"/>
               <w:left w:val="nil"/>
@@ -17183,23 +16827,22 @@
             <w:r>
               <w:rPr>
                 <w:rFonts w:hint="eastAsia" w:ascii="宋体" w:hAnsi="宋体" w:eastAsia="宋体" w:cs="宋体"/>
-                <w:b w:val="0"/>
-                <w:i w:val="0"/>
-                <w:iCs w:val="0"/>
-                <w:color w:val="000000"/>
-                <w:kern w:val="0"/>
-                <w:sz w:val="22"/>
-                <w:szCs w:val="22"/>
-                <w:u w:val="none"/>
-                <w:lang w:val="en-US" w:eastAsia="zh-CN" w:bidi="ar"/>
-              </w:rPr>
-              <w:t>.061</w:t>
-            </w:r>
-          </w:p>
-        </w:tc>
-        <w:tc>
-          <w:tcPr>
-            <w:tcW w:w="305" w:type="pct"/>
+                <w:i w:val="0"/>
+                <w:iCs w:val="0"/>
+                <w:color w:val="000000"/>
+                <w:kern w:val="0"/>
+                <w:sz w:val="22"/>
+                <w:szCs w:val="22"/>
+                <w:u w:val="none"/>
+                <w:lang w:val="en-US" w:eastAsia="zh-CN" w:bidi="ar"/>
+              </w:rPr>
+              <w:t>&lt;0.001</w:t>
+            </w:r>
+          </w:p>
+        </w:tc>
+        <w:tc>
+          <w:tcPr>
+            <w:tcW w:w="871" w:type="dxa"/>
             <w:tcBorders>
               <w:top w:val="nil"/>
               <w:left w:val="nil"/>
@@ -17232,17 +16875,16 @@
             <w:r>
               <w:rPr>
                 <w:rFonts w:hint="eastAsia" w:ascii="宋体" w:hAnsi="宋体" w:eastAsia="宋体" w:cs="宋体"/>
-                <w:b w:val="0"/>
-                <w:i w:val="0"/>
-                <w:iCs w:val="0"/>
-                <w:color w:val="000000"/>
-                <w:kern w:val="0"/>
-                <w:sz w:val="22"/>
-                <w:szCs w:val="22"/>
-                <w:u w:val="none"/>
-                <w:lang w:val="en-US" w:eastAsia="zh-CN" w:bidi="ar"/>
-              </w:rPr>
-              <w:t>1.040</w:t>
+                <w:i w:val="0"/>
+                <w:iCs w:val="0"/>
+                <w:color w:val="000000"/>
+                <w:kern w:val="0"/>
+                <w:sz w:val="22"/>
+                <w:szCs w:val="22"/>
+                <w:u w:val="none"/>
+                <w:lang w:val="en-US" w:eastAsia="zh-CN" w:bidi="ar"/>
+              </w:rPr>
+              <w:t>1.04</w:t>
             </w:r>
           </w:p>
         </w:tc>
@@ -17447,7 +17089,7 @@
         </w:tc>
         <w:tc>
           <w:tcPr>
-            <w:tcW w:w="356" w:type="pct"/>
+            <w:tcW w:w="1009" w:type="dxa"/>
             <w:tcBorders>
               <w:top w:val="nil"/>
               <w:left w:val="nil"/>
@@ -17480,23 +17122,22 @@
             <w:r>
               <w:rPr>
                 <w:rFonts w:hint="eastAsia" w:ascii="宋体" w:hAnsi="宋体" w:eastAsia="宋体" w:cs="宋体"/>
-                <w:b w:val="0"/>
-                <w:i w:val="0"/>
-                <w:iCs w:val="0"/>
-                <w:color w:val="000000"/>
-                <w:kern w:val="0"/>
-                <w:sz w:val="22"/>
-                <w:szCs w:val="22"/>
-                <w:u w:val="none"/>
-                <w:lang w:val="en-US" w:eastAsia="zh-CN" w:bidi="ar"/>
-              </w:rPr>
-              <w:t>0.186</w:t>
-            </w:r>
-          </w:p>
-        </w:tc>
-        <w:tc>
-          <w:tcPr>
-            <w:tcW w:w="389" w:type="pct"/>
+                <w:i w:val="0"/>
+                <w:iCs w:val="0"/>
+                <w:color w:val="000000"/>
+                <w:kern w:val="0"/>
+                <w:sz w:val="22"/>
+                <w:szCs w:val="22"/>
+                <w:u w:val="none"/>
+                <w:lang w:val="en-US" w:eastAsia="zh-CN" w:bidi="ar"/>
+              </w:rPr>
+              <w:t>0.239</w:t>
+            </w:r>
+          </w:p>
+        </w:tc>
+        <w:tc>
+          <w:tcPr>
+            <w:tcW w:w="1103" w:type="dxa"/>
             <w:tcBorders>
               <w:top w:val="nil"/>
               <w:left w:val="nil"/>
@@ -17529,39 +17170,22 @@
             <w:r>
               <w:rPr>
                 <w:rFonts w:hint="eastAsia" w:ascii="宋体" w:hAnsi="宋体" w:eastAsia="宋体" w:cs="宋体"/>
-                <w:b w:val="0"/>
-                <w:i w:val="0"/>
-                <w:iCs w:val="0"/>
-                <w:color w:val="000000"/>
-                <w:kern w:val="0"/>
-                <w:sz w:val="22"/>
-                <w:szCs w:val="22"/>
-                <w:u w:val="none"/>
-                <w:lang w:val="en-US" w:eastAsia="zh-CN" w:bidi="ar"/>
-              </w:rPr>
-              <w:t>3.561</w:t>
-            </w:r>
-            <w:r>
-              <w:rPr>
-                <w:rFonts w:hint="eastAsia" w:ascii="宋体" w:hAnsi="宋体" w:eastAsia="宋体" w:cs="宋体"/>
-                <w:b w:val="0"/>
-                <w:i w:val="0"/>
-                <w:iCs w:val="0"/>
-                <w:color w:val="000000"/>
-                <w:kern w:val="0"/>
-                <w:sz w:val="22"/>
-                <w:szCs w:val="22"/>
-                <w:u w:val="none"/>
-                <w:vertAlign w:val="superscript"/>
-                <w:lang w:val="en-US" w:eastAsia="zh-CN" w:bidi="ar"/>
-              </w:rPr>
-              <w:t>***</w:t>
-            </w:r>
-          </w:p>
-        </w:tc>
-        <w:tc>
-          <w:tcPr>
-            <w:tcW w:w="332" w:type="pct"/>
+                <w:i w:val="0"/>
+                <w:iCs w:val="0"/>
+                <w:color w:val="000000"/>
+                <w:kern w:val="0"/>
+                <w:sz w:val="22"/>
+                <w:szCs w:val="22"/>
+                <w:u w:val="none"/>
+                <w:lang w:val="en-US" w:eastAsia="zh-CN" w:bidi="ar"/>
+              </w:rPr>
+              <w:t>4.669</w:t>
+            </w:r>
+          </w:p>
+        </w:tc>
+        <w:tc>
+          <w:tcPr>
+            <w:tcW w:w="941" w:type="dxa"/>
             <w:tcBorders>
               <w:top w:val="nil"/>
               <w:left w:val="nil"/>
@@ -17594,23 +17218,22 @@
             <w:r>
               <w:rPr>
                 <w:rFonts w:hint="eastAsia" w:ascii="宋体" w:hAnsi="宋体" w:eastAsia="宋体" w:cs="宋体"/>
-                <w:b w:val="0"/>
-                <w:i w:val="0"/>
-                <w:iCs w:val="0"/>
-                <w:color w:val="000000"/>
-                <w:kern w:val="0"/>
-                <w:sz w:val="22"/>
-                <w:szCs w:val="22"/>
-                <w:u w:val="none"/>
-                <w:lang w:val="en-US" w:eastAsia="zh-CN" w:bidi="ar"/>
-              </w:rPr>
-              <w:t>.035</w:t>
-            </w:r>
-          </w:p>
-        </w:tc>
-        <w:tc>
-          <w:tcPr>
-            <w:tcW w:w="305" w:type="pct"/>
+                <w:i w:val="0"/>
+                <w:iCs w:val="0"/>
+                <w:color w:val="000000"/>
+                <w:kern w:val="0"/>
+                <w:sz w:val="22"/>
+                <w:szCs w:val="22"/>
+                <w:u w:val="none"/>
+                <w:lang w:val="en-US" w:eastAsia="zh-CN" w:bidi="ar"/>
+              </w:rPr>
+              <w:t>&lt;0.001</w:t>
+            </w:r>
+          </w:p>
+        </w:tc>
+        <w:tc>
+          <w:tcPr>
+            <w:tcW w:w="870" w:type="dxa"/>
             <w:tcBorders>
               <w:top w:val="nil"/>
               <w:left w:val="nil"/>
@@ -17643,7 +17266,6 @@
             <w:r>
               <w:rPr>
                 <w:rFonts w:hint="eastAsia" w:ascii="宋体" w:hAnsi="宋体" w:eastAsia="宋体" w:cs="宋体"/>
-                <w:b w:val="0"/>
                 <w:i w:val="0"/>
                 <w:iCs w:val="0"/>
                 <w:color w:val="000000"/>
@@ -17695,7 +17317,7 @@
         </w:tc>
         <w:tc>
           <w:tcPr>
-            <w:tcW w:w="356" w:type="pct"/>
+            <w:tcW w:w="1009" w:type="dxa"/>
             <w:tcBorders>
               <w:top w:val="nil"/>
               <w:left w:val="nil"/>
@@ -17728,23 +17350,22 @@
             <w:r>
               <w:rPr>
                 <w:rFonts w:hint="eastAsia" w:ascii="宋体" w:hAnsi="宋体" w:eastAsia="宋体" w:cs="宋体"/>
-                <w:b w:val="0"/>
-                <w:i w:val="0"/>
-                <w:iCs w:val="0"/>
-                <w:color w:val="000000"/>
-                <w:kern w:val="0"/>
-                <w:sz w:val="22"/>
-                <w:szCs w:val="22"/>
-                <w:u w:val="none"/>
-                <w:lang w:val="en-US" w:eastAsia="zh-CN" w:bidi="ar"/>
-              </w:rPr>
-              <w:t>0.179</w:t>
-            </w:r>
-          </w:p>
-        </w:tc>
-        <w:tc>
-          <w:tcPr>
-            <w:tcW w:w="389" w:type="pct"/>
+                <w:i w:val="0"/>
+                <w:iCs w:val="0"/>
+                <w:color w:val="000000"/>
+                <w:kern w:val="0"/>
+                <w:sz w:val="22"/>
+                <w:szCs w:val="22"/>
+                <w:u w:val="none"/>
+                <w:lang w:val="en-US" w:eastAsia="zh-CN" w:bidi="ar"/>
+              </w:rPr>
+              <w:t>0.233</w:t>
+            </w:r>
+          </w:p>
+        </w:tc>
+        <w:tc>
+          <w:tcPr>
+            <w:tcW w:w="1103" w:type="dxa"/>
             <w:tcBorders>
               <w:top w:val="nil"/>
               <w:left w:val="nil"/>
@@ -17777,39 +17398,22 @@
             <w:r>
               <w:rPr>
                 <w:rFonts w:hint="eastAsia" w:ascii="宋体" w:hAnsi="宋体" w:eastAsia="宋体" w:cs="宋体"/>
-                <w:b w:val="0"/>
-                <w:i w:val="0"/>
-                <w:iCs w:val="0"/>
-                <w:color w:val="000000"/>
-                <w:kern w:val="0"/>
-                <w:sz w:val="22"/>
-                <w:szCs w:val="22"/>
-                <w:u w:val="none"/>
-                <w:lang w:val="en-US" w:eastAsia="zh-CN" w:bidi="ar"/>
-              </w:rPr>
-              <w:t>3.444</w:t>
-            </w:r>
-            <w:r>
-              <w:rPr>
-                <w:rFonts w:hint="eastAsia" w:ascii="宋体" w:hAnsi="宋体" w:eastAsia="宋体" w:cs="宋体"/>
-                <w:b w:val="0"/>
-                <w:i w:val="0"/>
-                <w:iCs w:val="0"/>
-                <w:color w:val="000000"/>
-                <w:kern w:val="0"/>
-                <w:sz w:val="22"/>
-                <w:szCs w:val="22"/>
-                <w:u w:val="none"/>
-                <w:vertAlign w:val="superscript"/>
-                <w:lang w:val="en-US" w:eastAsia="zh-CN" w:bidi="ar"/>
-              </w:rPr>
-              <w:t>***</w:t>
-            </w:r>
-          </w:p>
-        </w:tc>
-        <w:tc>
-          <w:tcPr>
-            <w:tcW w:w="332" w:type="pct"/>
+                <w:i w:val="0"/>
+                <w:iCs w:val="0"/>
+                <w:color w:val="000000"/>
+                <w:kern w:val="0"/>
+                <w:sz w:val="22"/>
+                <w:szCs w:val="22"/>
+                <w:u w:val="none"/>
+                <w:lang w:val="en-US" w:eastAsia="zh-CN" w:bidi="ar"/>
+              </w:rPr>
+              <w:t>4.563</w:t>
+            </w:r>
+          </w:p>
+        </w:tc>
+        <w:tc>
+          <w:tcPr>
+            <w:tcW w:w="942" w:type="dxa"/>
             <w:tcBorders>
               <w:top w:val="nil"/>
               <w:left w:val="nil"/>
@@ -17842,23 +17446,22 @@
             <w:r>
               <w:rPr>
                 <w:rFonts w:hint="eastAsia" w:ascii="宋体" w:hAnsi="宋体" w:eastAsia="宋体" w:cs="宋体"/>
-                <w:b w:val="0"/>
-                <w:i w:val="0"/>
-                <w:iCs w:val="0"/>
-                <w:color w:val="000000"/>
-                <w:kern w:val="0"/>
-                <w:sz w:val="22"/>
-                <w:szCs w:val="22"/>
-                <w:u w:val="none"/>
-                <w:lang w:val="en-US" w:eastAsia="zh-CN" w:bidi="ar"/>
-              </w:rPr>
-              <w:t>.032</w:t>
-            </w:r>
-          </w:p>
-        </w:tc>
-        <w:tc>
-          <w:tcPr>
-            <w:tcW w:w="305" w:type="pct"/>
+                <w:i w:val="0"/>
+                <w:iCs w:val="0"/>
+                <w:color w:val="000000"/>
+                <w:kern w:val="0"/>
+                <w:sz w:val="22"/>
+                <w:szCs w:val="22"/>
+                <w:u w:val="none"/>
+                <w:lang w:val="en-US" w:eastAsia="zh-CN" w:bidi="ar"/>
+              </w:rPr>
+              <w:t>&lt;0.001</w:t>
+            </w:r>
+          </w:p>
+        </w:tc>
+        <w:tc>
+          <w:tcPr>
+            <w:tcW w:w="871" w:type="dxa"/>
             <w:tcBorders>
               <w:top w:val="nil"/>
               <w:left w:val="nil"/>
@@ -17891,7 +17494,6 @@
             <w:r>
               <w:rPr>
                 <w:rFonts w:hint="eastAsia" w:ascii="宋体" w:hAnsi="宋体" w:eastAsia="宋体" w:cs="宋体"/>
-                <w:b w:val="0"/>
                 <w:i w:val="0"/>
                 <w:iCs w:val="0"/>
                 <w:color w:val="000000"/>
@@ -18251,7 +17853,7 @@
         </w:tc>
         <w:tc>
           <w:tcPr>
-            <w:tcW w:w="356" w:type="pct"/>
+            <w:tcW w:w="1009" w:type="dxa"/>
             <w:tcBorders>
               <w:top w:val="nil"/>
               <w:left w:val="nil"/>
@@ -18284,23 +17886,22 @@
             <w:r>
               <w:rPr>
                 <w:rFonts w:hint="eastAsia" w:ascii="宋体" w:hAnsi="宋体" w:eastAsia="宋体" w:cs="宋体"/>
-                <w:b w:val="0"/>
-                <w:i w:val="0"/>
-                <w:iCs w:val="0"/>
-                <w:color w:val="000000"/>
-                <w:kern w:val="0"/>
-                <w:sz w:val="22"/>
-                <w:szCs w:val="22"/>
-                <w:u w:val="none"/>
-                <w:lang w:val="en-US" w:eastAsia="zh-CN" w:bidi="ar"/>
-              </w:rPr>
-              <w:t>-0.116</w:t>
-            </w:r>
-          </w:p>
-        </w:tc>
-        <w:tc>
-          <w:tcPr>
-            <w:tcW w:w="389" w:type="pct"/>
+                <w:i w:val="0"/>
+                <w:iCs w:val="0"/>
+                <w:color w:val="000000"/>
+                <w:kern w:val="0"/>
+                <w:sz w:val="22"/>
+                <w:szCs w:val="22"/>
+                <w:u w:val="none"/>
+                <w:lang w:val="en-US" w:eastAsia="zh-CN" w:bidi="ar"/>
+              </w:rPr>
+              <w:t>-0.104</w:t>
+            </w:r>
+          </w:p>
+        </w:tc>
+        <w:tc>
+          <w:tcPr>
+            <w:tcW w:w="1103" w:type="dxa"/>
             <w:tcBorders>
               <w:top w:val="nil"/>
               <w:left w:val="nil"/>
@@ -18333,39 +17934,22 @@
             <w:r>
               <w:rPr>
                 <w:rFonts w:hint="eastAsia" w:ascii="宋体" w:hAnsi="宋体" w:eastAsia="宋体" w:cs="宋体"/>
-                <w:b w:val="0"/>
-                <w:i w:val="0"/>
-                <w:iCs w:val="0"/>
-                <w:color w:val="000000"/>
-                <w:kern w:val="0"/>
-                <w:sz w:val="22"/>
-                <w:szCs w:val="22"/>
-                <w:u w:val="none"/>
-                <w:lang w:val="en-US" w:eastAsia="zh-CN" w:bidi="ar"/>
-              </w:rPr>
-              <w:t>-2.277</w:t>
-            </w:r>
-            <w:r>
-              <w:rPr>
-                <w:rFonts w:hint="eastAsia" w:ascii="宋体" w:hAnsi="宋体" w:eastAsia="宋体" w:cs="宋体"/>
-                <w:b w:val="0"/>
-                <w:i w:val="0"/>
-                <w:iCs w:val="0"/>
-                <w:color w:val="000000"/>
-                <w:kern w:val="0"/>
-                <w:sz w:val="22"/>
-                <w:szCs w:val="22"/>
-                <w:u w:val="none"/>
-                <w:vertAlign w:val="superscript"/>
-                <w:lang w:val="en-US" w:eastAsia="zh-CN" w:bidi="ar"/>
-              </w:rPr>
-              <w:t>*</w:t>
-            </w:r>
-          </w:p>
-        </w:tc>
-        <w:tc>
-          <w:tcPr>
-            <w:tcW w:w="332" w:type="pct"/>
+                <w:i w:val="0"/>
+                <w:iCs w:val="0"/>
+                <w:color w:val="000000"/>
+                <w:kern w:val="0"/>
+                <w:sz w:val="22"/>
+                <w:szCs w:val="22"/>
+                <w:u w:val="none"/>
+                <w:lang w:val="en-US" w:eastAsia="zh-CN" w:bidi="ar"/>
+              </w:rPr>
+              <w:t>-2.076</w:t>
+            </w:r>
+          </w:p>
+        </w:tc>
+        <w:tc>
+          <w:tcPr>
+            <w:tcW w:w="942" w:type="dxa"/>
             <w:tcBorders>
               <w:top w:val="nil"/>
               <w:left w:val="nil"/>
@@ -18398,23 +17982,22 @@
             <w:r>
               <w:rPr>
                 <w:rFonts w:hint="eastAsia" w:ascii="宋体" w:hAnsi="宋体" w:eastAsia="宋体" w:cs="宋体"/>
-                <w:b w:val="0"/>
-                <w:i w:val="0"/>
-                <w:iCs w:val="0"/>
-                <w:color w:val="000000"/>
-                <w:kern w:val="0"/>
-                <w:sz w:val="22"/>
-                <w:szCs w:val="22"/>
-                <w:u w:val="none"/>
-                <w:lang w:val="en-US" w:eastAsia="zh-CN" w:bidi="ar"/>
-              </w:rPr>
-              <w:t>.014</w:t>
-            </w:r>
-          </w:p>
-        </w:tc>
-        <w:tc>
-          <w:tcPr>
-            <w:tcW w:w="305" w:type="pct"/>
+                <w:i w:val="0"/>
+                <w:iCs w:val="0"/>
+                <w:color w:val="000000"/>
+                <w:kern w:val="0"/>
+                <w:sz w:val="22"/>
+                <w:szCs w:val="22"/>
+                <w:u w:val="none"/>
+                <w:lang w:val="en-US" w:eastAsia="zh-CN" w:bidi="ar"/>
+              </w:rPr>
+              <w:t>0.039</w:t>
+            </w:r>
+          </w:p>
+        </w:tc>
+        <w:tc>
+          <w:tcPr>
+            <w:tcW w:w="871" w:type="dxa"/>
             <w:tcBorders>
               <w:top w:val="nil"/>
               <w:left w:val="nil"/>
@@ -18447,7 +18030,6 @@
             <w:r>
               <w:rPr>
                 <w:rFonts w:hint="eastAsia" w:ascii="宋体" w:hAnsi="宋体" w:eastAsia="宋体" w:cs="宋体"/>
-                <w:b w:val="0"/>
                 <w:i w:val="0"/>
                 <w:iCs w:val="0"/>
                 <w:color w:val="000000"/>
@@ -18572,7 +18154,7 @@
                 <w:u w:val="none"/>
                 <w:lang w:val="en-US"/>
               </w:rPr>
-              <w:t xml:space="preserve">0.804(7,356) </w:t>
+              <w:t xml:space="preserve">0.730(7,356) </w:t>
             </w:r>
           </w:p>
         </w:tc>
@@ -18647,7 +18229,7 @@
                 <w:u w:val="none"/>
                 <w:lang w:val="en-US"/>
               </w:rPr>
-              <w:t>4.161(9,354)</w:t>
+              <w:t>5.991(9,354)</w:t>
             </w:r>
             <w:r>
               <w:rPr>
@@ -18738,7 +18320,7 @@
                 <w:u w:val="none"/>
                 <w:lang w:val="en-US"/>
               </w:rPr>
-              <w:t>4.307(10,353)</w:t>
+              <w:t>5.874(10,353)</w:t>
             </w:r>
             <w:r>
               <w:rPr>
@@ -18869,7 +18451,7 @@
                 <w:u w:val="none"/>
                 <w:lang w:val="en-US"/>
               </w:rPr>
-              <w:t>0.016</w:t>
+              <w:t>0.014</w:t>
             </w:r>
           </w:p>
         </w:tc>
@@ -18944,7 +18526,7 @@
                 <w:u w:val="none"/>
                 <w:lang w:val="en-US"/>
               </w:rPr>
-              <w:t>0.096</w:t>
+              <w:t>0.132</w:t>
             </w:r>
           </w:p>
         </w:tc>
@@ -19019,7 +18601,7 @@
                 <w:u w:val="none"/>
                 <w:lang w:val="en-US"/>
               </w:rPr>
-              <w:t>0.109</w:t>
+              <w:t>0.143</w:t>
             </w:r>
           </w:p>
         </w:tc>
@@ -19164,7 +18746,7 @@
                 <w:u w:val="none"/>
                 <w:lang w:val="en-US"/>
               </w:rPr>
-              <w:t>-0.004</w:t>
+              <w:t>-0.005</w:t>
             </w:r>
           </w:p>
         </w:tc>
@@ -19239,7 +18821,7 @@
                 <w:u w:val="none"/>
                 <w:lang w:val="en-US"/>
               </w:rPr>
-              <w:t>0.073</w:t>
+              <w:t>0.110</w:t>
             </w:r>
           </w:p>
         </w:tc>
@@ -19314,7 +18896,7 @@
                 <w:u w:val="none"/>
                 <w:lang w:val="en-US"/>
               </w:rPr>
-              <w:t>0.084</w:t>
+              <w:t>0.118</w:t>
             </w:r>
           </w:p>
         </w:tc>
@@ -19429,7 +19011,7 @@
                 <w:u w:val="none"/>
                 <w:lang w:val="en-US"/>
               </w:rPr>
-              <w:t>0.016</w:t>
+              <w:t>0.014</w:t>
             </w:r>
           </w:p>
         </w:tc>
@@ -19504,7 +19086,7 @@
                 <w:u w:val="none"/>
                 <w:lang w:val="en-US"/>
               </w:rPr>
-              <w:t>0.080</w:t>
+              <w:t>0.118</w:t>
             </w:r>
           </w:p>
         </w:tc>
@@ -19579,7 +19161,7 @@
                 <w:u w:val="none"/>
                 <w:lang w:val="en-US"/>
               </w:rPr>
-              <w:t>0.013</w:t>
+              <w:t>0.010</w:t>
             </w:r>
           </w:p>
         </w:tc>
@@ -19693,7 +19275,7 @@
                 <w:u w:val="none"/>
                 <w:lang w:val="en-US"/>
               </w:rPr>
-              <w:t xml:space="preserve">0.585(7,356) </w:t>
+              <w:t xml:space="preserve">0.730(7,356) </w:t>
             </w:r>
           </w:p>
         </w:tc>
@@ -19768,7 +19350,7 @@
                 <w:u w:val="none"/>
                 <w:lang w:val="en-US"/>
               </w:rPr>
-              <w:t xml:space="preserve">15.678(2,354) </w:t>
+              <w:t xml:space="preserve">24.074(2,354) </w:t>
             </w:r>
             <w:r>
               <w:rPr>
@@ -19859,7 +19441,7 @@
                 <w:u w:val="none"/>
                 <w:lang w:val="en-US"/>
               </w:rPr>
-              <w:t xml:space="preserve">5.184(1,353) </w:t>
+              <w:t xml:space="preserve">4.309(1,353) </w:t>
             </w:r>
             <w:r>
               <w:rPr>

</xml_diff>